<commit_message>
updated Attack Surface Analysis - Analysis Procedure (images / license) and associated issue template (legend) annotation)
</commit_message>
<xml_diff>
--- a/source/reference_documents/tertiary_documents/design/Attack Surface Analysis/analysis/Attack Surface Analysis - Analysis.docx
+++ b/source/reference_documents/tertiary_documents/design/Attack Surface Analysis/analysis/Attack Surface Analysis - Analysis.docx
@@ -1,6 +1,6 @@
 
 <file path=word/document.xml><?xml version="1.0" encoding="utf-8"?>
-<w:document xmlns:wpc="http://schemas.microsoft.com/office/word/2010/wordprocessingCanvas" xmlns:cx="http://schemas.microsoft.com/office/drawing/2014/chartex" xmlns:cx1="http://schemas.microsoft.com/office/drawing/2015/9/8/chartex" xmlns:cx2="http://schemas.microsoft.com/office/drawing/2015/10/21/chartex" xmlns:cx3="http://schemas.microsoft.com/office/drawing/2016/5/9/chartex" xmlns:cx4="http://schemas.microsoft.com/office/drawing/2016/5/10/chartex" xmlns:cx5="http://schemas.microsoft.com/office/drawing/2016/5/11/chartex" xmlns:cx6="http://schemas.microsoft.com/office/drawing/2016/5/12/chartex" xmlns:cx7="http://schemas.microsoft.com/office/drawing/2016/5/13/chartex" xmlns:cx8="http://schemas.microsoft.com/office/drawing/2016/5/14/chartex" xmlns:mc="http://schemas.openxmlformats.org/markup-compatibility/2006" xmlns:aink="http://schemas.microsoft.com/office/drawing/2016/ink" xmlns:am3d="http://schemas.microsoft.com/office/drawing/2017/model3d" xmlns:o="urn:schemas-microsoft-com:office:office" xmlns:oel="http://schemas.microsoft.com/office/2019/extlst" xmlns:r="http://schemas.openxmlformats.org/officeDocument/2006/relationships" xmlns:m="http://schemas.openxmlformats.org/officeDocument/2006/math" xmlns:v="urn:schemas-microsoft-com:vml" xmlns:wp14="http://schemas.microsoft.com/office/word/2010/wordprocessingDrawing" xmlns:wp="http://schemas.openxmlformats.org/drawingml/2006/wordprocessingDrawing" xmlns:w10="urn:schemas-microsoft-com:office:word" xmlns:w="http://schemas.openxmlformats.org/wordprocessingml/2006/main" xmlns:w14="http://schemas.microsoft.com/office/word/2010/wordml" xmlns:w15="http://schemas.microsoft.com/office/word/2012/wordml" xmlns:w16cex="http://schemas.microsoft.com/office/word/2018/wordml/cex" xmlns:w16cid="http://schemas.microsoft.com/office/word/2016/wordml/cid" xmlns:w16="http://schemas.microsoft.com/office/word/2018/wordml" xmlns:w16du="http://schemas.microsoft.com/office/word/2023/wordml/word16du" xmlns:w16sdtdh="http://schemas.microsoft.com/office/word/2020/wordml/sdtdatahash" xmlns:w16se="http://schemas.microsoft.com/office/word/2015/wordml/symex" xmlns:wpg="http://schemas.microsoft.com/office/word/2010/wordprocessingGroup" xmlns:wpi="http://schemas.microsoft.com/office/word/2010/wordprocessingInk" xmlns:wne="http://schemas.microsoft.com/office/word/2006/wordml" xmlns:wps="http://schemas.microsoft.com/office/word/2010/wordprocessingShape" mc:Ignorable="w14 w15 w16se w16cid w16 w16cex w16sdtdh w16du wp14">
+<w:document xmlns:wpc="http://schemas.microsoft.com/office/word/2010/wordprocessingCanvas" xmlns:cx="http://schemas.microsoft.com/office/drawing/2014/chartex" xmlns:cx1="http://schemas.microsoft.com/office/drawing/2015/9/8/chartex" xmlns:cx2="http://schemas.microsoft.com/office/drawing/2015/10/21/chartex" xmlns:cx3="http://schemas.microsoft.com/office/drawing/2016/5/9/chartex" xmlns:cx4="http://schemas.microsoft.com/office/drawing/2016/5/10/chartex" xmlns:cx5="http://schemas.microsoft.com/office/drawing/2016/5/11/chartex" xmlns:cx6="http://schemas.microsoft.com/office/drawing/2016/5/12/chartex" xmlns:cx7="http://schemas.microsoft.com/office/drawing/2016/5/13/chartex" xmlns:cx8="http://schemas.microsoft.com/office/drawing/2016/5/14/chartex" xmlns:mc="http://schemas.openxmlformats.org/markup-compatibility/2006" xmlns:aink="http://schemas.microsoft.com/office/drawing/2016/ink" xmlns:am3d="http://schemas.microsoft.com/office/drawing/2017/model3d" xmlns:o="urn:schemas-microsoft-com:office:office" xmlns:oel="http://schemas.microsoft.com/office/2019/extlst" xmlns:r="http://schemas.openxmlformats.org/officeDocument/2006/relationships" xmlns:m="http://schemas.openxmlformats.org/officeDocument/2006/math" xmlns:v="urn:schemas-microsoft-com:vml" xmlns:wp14="http://schemas.microsoft.com/office/word/2010/wordprocessingDrawing" xmlns:wp="http://schemas.openxmlformats.org/drawingml/2006/wordprocessingDrawing" xmlns:w10="urn:schemas-microsoft-com:office:word" xmlns:w="http://schemas.openxmlformats.org/wordprocessingml/2006/main" xmlns:w14="http://schemas.microsoft.com/office/word/2010/wordml" xmlns:w15="http://schemas.microsoft.com/office/word/2012/wordml" xmlns:w16cex="http://schemas.microsoft.com/office/word/2018/wordml/cex" xmlns:w16cid="http://schemas.microsoft.com/office/word/2016/wordml/cid" xmlns:w16="http://schemas.microsoft.com/office/word/2018/wordml" xmlns:w16du="http://schemas.microsoft.com/office/word/2023/wordml/word16du" xmlns:w16sdtdh="http://schemas.microsoft.com/office/word/2020/wordml/sdtdatahash" xmlns:w16sdtfl="http://schemas.microsoft.com/office/word/2024/wordml/sdtformatlock" xmlns:w16se="http://schemas.microsoft.com/office/word/2015/wordml/symex" xmlns:wpg="http://schemas.microsoft.com/office/word/2010/wordprocessingGroup" xmlns:wpi="http://schemas.microsoft.com/office/word/2010/wordprocessingInk" xmlns:wne="http://schemas.microsoft.com/office/word/2006/wordml" xmlns:wps="http://schemas.microsoft.com/office/word/2010/wordprocessingShape" mc:Ignorable="w14 w15 w16se w16cid w16 w16cex w16sdtdh w16sdtfl w16du wp14">
   <w:body>
     <w:p>
       <w:pPr>
@@ -38,7 +38,7 @@
         <w:t xml:space="preserve">Version </w:t>
       </w:r>
       <w:r>
-        <w:t>5</w:t>
+        <w:t>6</w:t>
       </w:r>
     </w:p>
     <w:p>
@@ -55,7 +55,7 @@
         <w:rPr>
           <w:noProof/>
         </w:rPr>
-        <w:t>11/21/24 12:32 PM</w:t>
+        <w:t>12/4/25 8:05 AM</w:t>
       </w:r>
       <w:r>
         <w:fldChar w:fldCharType="end"/>
@@ -253,45 +253,7 @@
         </w:rPr>
       </w:pPr>
       <w:r>
-        <w:t xml:space="preserve">This document is motivated by the need to have the minimal necessary attack surface. This is necessary given the nature of safety-critical, cyber-physical systems, subject to certifications such as </w:t>
-      </w:r>
-      <w:r>
-        <w:rPr>
-          <w:b/>
-          <w:bCs/>
-        </w:rPr>
-        <w:t>ISO</w:t>
-      </w:r>
-      <w:r>
-        <w:rPr>
-          <w:b/>
-          <w:bCs/>
-        </w:rPr>
-        <w:t>/SAE</w:t>
-      </w:r>
-      <w:r>
-        <w:rPr>
-          <w:b/>
-          <w:bCs/>
-        </w:rPr>
-        <w:t xml:space="preserve"> 21434</w:t>
-      </w:r>
-      <w:r>
-        <w:t xml:space="preserve"> and </w:t>
-      </w:r>
-      <w:r>
-        <w:rPr>
-          <w:b/>
-          <w:bCs/>
-        </w:rPr>
-        <w:t xml:space="preserve">ISO </w:t>
-      </w:r>
-      <w:r>
-        <w:rPr>
-          <w:b/>
-          <w:bCs/>
-        </w:rPr>
-        <w:t>26262</w:t>
+        <w:t>This document is motivated by the need to have the minimal necessary attack surface. This is necessary given the nature of safety-critical, cyber-physical systems</w:t>
       </w:r>
       <w:r>
         <w:rPr>
@@ -302,14 +264,103 @@
     </w:p>
     <w:p>
       <w:pPr>
-        <w:pStyle w:val="FirstParagraph"/>
-        <w:jc w:val="both"/>
-        <w:rPr>
-          <w:color w:val="FF0000"/>
-        </w:rPr>
+        <w:pStyle w:val="Heading1"/>
       </w:pPr>
       <w:bookmarkStart w:id="3" w:name="_f5diy2ktdyyf" w:colFirst="0" w:colLast="0"/>
       <w:bookmarkEnd w:id="3"/>
+      <w:r>
+        <w:t>License</w:t>
+      </w:r>
+    </w:p>
+    <w:p>
+      <w:pPr>
+        <w:jc w:val="both"/>
+      </w:pPr>
+      <w:r>
+        <w:t xml:space="preserve">This work </w:t>
+      </w:r>
+      <w:r>
+        <w:t xml:space="preserve">was created by </w:t>
+      </w:r>
+      <w:r>
+        <w:rPr>
+          <w:b/>
+          <w:bCs/>
+        </w:rPr>
+        <w:t>Torc Robotics</w:t>
+      </w:r>
+      <w:r>
+        <w:t xml:space="preserve"> and </w:t>
+      </w:r>
+      <w:r>
+        <w:t xml:space="preserve">is licensed under the </w:t>
+      </w:r>
+      <w:r>
+        <w:rPr>
+          <w:b/>
+          <w:bCs/>
+        </w:rPr>
+        <w:t>Creative Commons Attribution-Share Alike (CC</w:t>
+      </w:r>
+      <w:r>
+        <w:rPr>
+          <w:b/>
+          <w:bCs/>
+        </w:rPr>
+        <w:t xml:space="preserve"> BY</w:t>
+      </w:r>
+      <w:r>
+        <w:rPr>
+          <w:b/>
+          <w:bCs/>
+        </w:rPr>
+        <w:t>-SA</w:t>
+      </w:r>
+      <w:r>
+        <w:rPr>
+          <w:b/>
+          <w:bCs/>
+        </w:rPr>
+        <w:t>-4.0</w:t>
+      </w:r>
+      <w:r>
+        <w:rPr>
+          <w:b/>
+          <w:bCs/>
+        </w:rPr>
+        <w:t>)</w:t>
+      </w:r>
+      <w:r>
+        <w:t xml:space="preserve"> License</w:t>
+      </w:r>
+      <w:r>
+        <w:t>.</w:t>
+      </w:r>
+    </w:p>
+    <w:p>
+      <w:pPr>
+        <w:pStyle w:val="FirstParagraph"/>
+        <w:rPr>
+          <w:rStyle w:val="Hyperlink"/>
+        </w:rPr>
+      </w:pPr>
+      <w:hyperlink r:id="rId7" w:history="1">
+        <w:r>
+          <w:rPr>
+            <w:rStyle w:val="Hyperlink"/>
+          </w:rPr>
+          <w:t>https://creativecommons.org/licenses/by/4.0/legalcode</w:t>
+        </w:r>
+      </w:hyperlink>
+    </w:p>
+    <w:p>
+      <w:pPr>
+        <w:pStyle w:val="FirstParagraph"/>
+        <w:jc w:val="both"/>
+        <w:rPr>
+          <w:color w:val="FF0000"/>
+        </w:rPr>
+      </w:pPr>
     </w:p>
     <w:p>
       <w:pPr>
@@ -1180,7 +1231,7 @@
                     <pic:cNvPicPr/>
                   </pic:nvPicPr>
                   <pic:blipFill>
-                    <a:blip r:embed="rId7"/>
+                    <a:blip r:embed="rId8"/>
                     <a:stretch>
                       <a:fillRect/>
                     </a:stretch>
@@ -2641,7 +2692,7 @@
                     <pic:cNvPicPr/>
                   </pic:nvPicPr>
                   <pic:blipFill>
-                    <a:blip r:embed="rId8"/>
+                    <a:blip r:embed="rId9"/>
                     <a:stretch>
                       <a:fillRect/>
                     </a:stretch>
@@ -2773,8 +2824,6 @@
       </w:r>
       <w:r>
         <w:tab/>
-      </w:r>
-      <w:r>
         <w:t xml:space="preserve">In this context, </w:t>
       </w:r>
       <w:r>
@@ -2795,10 +2844,7 @@
         <w:t>customer</w:t>
       </w:r>
       <w:r>
-        <w:t xml:space="preserve"> refers to the entity requiring the analysis activity</w:t>
-      </w:r>
-      <w:r>
-        <w:t>.</w:t>
+        <w:t xml:space="preserve"> refers to the entity requiring the analysis activity.</w:t>
       </w:r>
     </w:p>
     <w:p>
@@ -3018,10 +3064,10 @@
           <w:noProof/>
         </w:rPr>
         <w:drawing>
-          <wp:inline distT="0" distB="0" distL="0" distR="0" wp14:anchorId="30EFF1ED" wp14:editId="1BB4A4CC">
-            <wp:extent cx="5943600" cy="4178300"/>
+          <wp:inline distT="0" distB="0" distL="0" distR="0" wp14:anchorId="30EFF1ED" wp14:editId="4035D200">
+            <wp:extent cx="5943600" cy="1923802"/>
             <wp:effectExtent l="0" t="0" r="0" b="0"/>
-            <wp:docPr id="925224403" name="Picture 10" descr="A close-up of a book&#10;&#10;Description automatically generated"/>
+            <wp:docPr id="925224403" name="Picture 10"/>
             <wp:cNvGraphicFramePr>
               <a:graphicFrameLocks xmlns:a="http://schemas.openxmlformats.org/drawingml/2006/main" noChangeAspect="1"/>
             </wp:cNvGraphicFramePr>
@@ -3029,11 +3075,11 @@
               <a:graphicData uri="http://schemas.openxmlformats.org/drawingml/2006/picture">
                 <pic:pic xmlns:pic="http://schemas.openxmlformats.org/drawingml/2006/picture">
                   <pic:nvPicPr>
-                    <pic:cNvPr id="925224403" name="Picture 10" descr="A close-up of a book&#10;&#10;Description automatically generated"/>
+                    <pic:cNvPr id="925224403" name="Picture 10"/>
                     <pic:cNvPicPr/>
                   </pic:nvPicPr>
                   <pic:blipFill>
-                    <a:blip r:embed="rId9"/>
+                    <a:blip r:embed="rId10"/>
                     <a:stretch>
                       <a:fillRect/>
                     </a:stretch>
@@ -3041,7 +3087,7 @@
                   <pic:spPr>
                     <a:xfrm>
                       <a:off x="0" y="0"/>
-                      <a:ext cx="5943600" cy="4178300"/>
+                      <a:ext cx="5943600" cy="1923802"/>
                     </a:xfrm>
                     <a:prstGeom prst="rect">
                       <a:avLst/>
@@ -3235,9 +3281,9 @@
           <w:noProof/>
         </w:rPr>
         <w:drawing>
-          <wp:inline distT="0" distB="0" distL="0" distR="0" wp14:anchorId="3B3E7AD8" wp14:editId="30421925">
-            <wp:extent cx="5943600" cy="3117088"/>
-            <wp:effectExtent l="0" t="0" r="0" b="0"/>
+          <wp:inline distT="0" distB="0" distL="0" distR="0" wp14:anchorId="3B3E7AD8" wp14:editId="0DA00798">
+            <wp:extent cx="5943600" cy="1429807"/>
+            <wp:effectExtent l="0" t="0" r="0" b="5715"/>
             <wp:docPr id="969750798" name="Picture 18"/>
             <wp:cNvGraphicFramePr>
               <a:graphicFrameLocks xmlns:a="http://schemas.openxmlformats.org/drawingml/2006/main" noChangeAspect="1"/>
@@ -3250,7 +3296,7 @@
                     <pic:cNvPicPr/>
                   </pic:nvPicPr>
                   <pic:blipFill>
-                    <a:blip r:embed="rId10"/>
+                    <a:blip r:embed="rId11"/>
                     <a:stretch>
                       <a:fillRect/>
                     </a:stretch>
@@ -3258,7 +3304,7 @@
                   <pic:spPr>
                     <a:xfrm>
                       <a:off x="0" y="0"/>
-                      <a:ext cx="5943600" cy="3117088"/>
+                      <a:ext cx="5943600" cy="1429807"/>
                     </a:xfrm>
                     <a:prstGeom prst="rect">
                       <a:avLst/>
@@ -3404,10 +3450,10 @@
           <w:noProof/>
         </w:rPr>
         <w:drawing>
-          <wp:inline distT="0" distB="0" distL="0" distR="0" wp14:anchorId="4125ABA6" wp14:editId="4539EE43">
-            <wp:extent cx="5943600" cy="2595880"/>
-            <wp:effectExtent l="0" t="0" r="0" b="0"/>
-            <wp:docPr id="809414650" name="Picture 5" descr="A close-up of a list&#10;&#10;Description automatically generated"/>
+          <wp:inline distT="0" distB="0" distL="0" distR="0" wp14:anchorId="4125ABA6" wp14:editId="7BC30D2B">
+            <wp:extent cx="5943600" cy="1201248"/>
+            <wp:effectExtent l="0" t="0" r="0" b="5715"/>
+            <wp:docPr id="809414650" name="Picture 5"/>
             <wp:cNvGraphicFramePr>
               <a:graphicFrameLocks xmlns:a="http://schemas.openxmlformats.org/drawingml/2006/main" noChangeAspect="1"/>
             </wp:cNvGraphicFramePr>
@@ -3415,411 +3461,7 @@
               <a:graphicData uri="http://schemas.openxmlformats.org/drawingml/2006/picture">
                 <pic:pic xmlns:pic="http://schemas.openxmlformats.org/drawingml/2006/picture">
                   <pic:nvPicPr>
-                    <pic:cNvPr id="809414650" name="Picture 5" descr="A close-up of a list&#10;&#10;Description automatically generated"/>
-                    <pic:cNvPicPr/>
-                  </pic:nvPicPr>
-                  <pic:blipFill>
-                    <a:blip r:embed="rId11"/>
-                    <a:stretch>
-                      <a:fillRect/>
-                    </a:stretch>
-                  </pic:blipFill>
-                  <pic:spPr>
-                    <a:xfrm>
-                      <a:off x="0" y="0"/>
-                      <a:ext cx="5943600" cy="2595880"/>
-                    </a:xfrm>
-                    <a:prstGeom prst="rect">
-                      <a:avLst/>
-                    </a:prstGeom>
-                  </pic:spPr>
-                </pic:pic>
-              </a:graphicData>
-            </a:graphic>
-          </wp:inline>
-        </w:drawing>
-      </w:r>
-    </w:p>
-    <w:p>
-      <w:pPr>
-        <w:pStyle w:val="Heading3"/>
-      </w:pPr>
-      <w:r>
-        <w:t>ID</w:t>
-      </w:r>
-    </w:p>
-    <w:p>
-      <w:pPr>
-        <w:spacing w:after="240"/>
-      </w:pPr>
-      <w:r>
-        <w:t>This is the unique ID of the issue.</w:t>
-      </w:r>
-    </w:p>
-    <w:p>
-      <w:pPr>
-        <w:pStyle w:val="Heading3"/>
-      </w:pPr>
-      <w:r>
-        <w:t>feature</w:t>
-      </w:r>
-      <w:r>
-        <w:t xml:space="preserve"> ID</w:t>
-      </w:r>
-    </w:p>
-    <w:p>
-      <w:pPr>
-        <w:spacing w:after="240"/>
-        <w:jc w:val="both"/>
-      </w:pPr>
-      <w:r>
-        <w:t xml:space="preserve">This is the </w:t>
-      </w:r>
-      <w:r>
-        <w:t xml:space="preserve">unique ID corresponding to the </w:t>
-      </w:r>
-      <w:r>
-        <w:t>feature</w:t>
-      </w:r>
-      <w:r>
-        <w:t xml:space="preserve"> where the issue presents itself</w:t>
-      </w:r>
-      <w:r>
-        <w:t>.</w:t>
-      </w:r>
-    </w:p>
-    <w:p>
-      <w:pPr>
-        <w:pStyle w:val="Heading3"/>
-      </w:pPr>
-      <w:r>
-        <w:t>Issue</w:t>
-      </w:r>
-      <w:r>
-        <w:t xml:space="preserve"> Type</w:t>
-      </w:r>
-    </w:p>
-    <w:p>
-      <w:pPr>
-        <w:spacing w:after="240"/>
-      </w:pPr>
-      <w:r>
-        <w:t xml:space="preserve">This is the type of </w:t>
-      </w:r>
-      <w:r>
-        <w:t>the issue</w:t>
-      </w:r>
-      <w:r>
-        <w:t xml:space="preserve">. </w:t>
-      </w:r>
-      <w:r>
-        <w:t>Issue</w:t>
-      </w:r>
-      <w:r>
-        <w:t xml:space="preserve"> types include:</w:t>
-      </w:r>
-    </w:p>
-    <w:p>
-      <w:pPr>
-        <w:pStyle w:val="ListParagraph"/>
-        <w:numPr>
-          <w:ilvl w:val="0"/>
-          <w:numId w:val="8"/>
-        </w:numPr>
-        <w:spacing w:after="240"/>
-        <w:ind w:left="360"/>
-      </w:pPr>
-      <w:r>
-        <w:t>Data connection lifetime</w:t>
-      </w:r>
-    </w:p>
-    <w:p>
-      <w:pPr>
-        <w:pStyle w:val="ListParagraph"/>
-        <w:numPr>
-          <w:ilvl w:val="0"/>
-          <w:numId w:val="8"/>
-        </w:numPr>
-        <w:spacing w:after="240"/>
-        <w:ind w:left="360"/>
-      </w:pPr>
-      <w:r>
-        <w:t>Data structures</w:t>
-      </w:r>
-    </w:p>
-    <w:p>
-      <w:pPr>
-        <w:pStyle w:val="ListParagraph"/>
-        <w:numPr>
-          <w:ilvl w:val="0"/>
-          <w:numId w:val="8"/>
-        </w:numPr>
-        <w:spacing w:after="240"/>
-        <w:ind w:left="360"/>
-      </w:pPr>
-      <w:r>
-        <w:t>Diagnostics</w:t>
-      </w:r>
-    </w:p>
-    <w:p>
-      <w:pPr>
-        <w:pStyle w:val="ListParagraph"/>
-        <w:numPr>
-          <w:ilvl w:val="0"/>
-          <w:numId w:val="8"/>
-        </w:numPr>
-        <w:spacing w:after="240"/>
-        <w:ind w:left="360"/>
-      </w:pPr>
-      <w:r>
-        <w:t>Features</w:t>
-      </w:r>
-    </w:p>
-    <w:p>
-      <w:pPr>
-        <w:pStyle w:val="ListParagraph"/>
-        <w:numPr>
-          <w:ilvl w:val="0"/>
-          <w:numId w:val="8"/>
-        </w:numPr>
-        <w:spacing w:after="240"/>
-        <w:ind w:left="360"/>
-      </w:pPr>
-      <w:r>
-        <w:t>Memory pressure susceptibility</w:t>
-      </w:r>
-    </w:p>
-    <w:p>
-      <w:pPr>
-        <w:pStyle w:val="ListParagraph"/>
-        <w:numPr>
-          <w:ilvl w:val="0"/>
-          <w:numId w:val="8"/>
-        </w:numPr>
-        <w:spacing w:after="240"/>
-        <w:ind w:left="360"/>
-      </w:pPr>
-      <w:r>
-        <w:t>Ports</w:t>
-      </w:r>
-    </w:p>
-    <w:p>
-      <w:pPr>
-        <w:pStyle w:val="ListParagraph"/>
-        <w:numPr>
-          <w:ilvl w:val="0"/>
-          <w:numId w:val="8"/>
-        </w:numPr>
-        <w:spacing w:after="240"/>
-        <w:ind w:left="360"/>
-      </w:pPr>
-      <w:r>
-        <w:t>Protocols</w:t>
-      </w:r>
-    </w:p>
-    <w:p>
-      <w:pPr>
-        <w:pStyle w:val="ListParagraph"/>
-        <w:numPr>
-          <w:ilvl w:val="0"/>
-          <w:numId w:val="8"/>
-        </w:numPr>
-        <w:spacing w:after="240"/>
-        <w:ind w:left="360"/>
-      </w:pPr>
-      <w:r>
-        <w:t>Remote execution</w:t>
-      </w:r>
-    </w:p>
-    <w:p>
-      <w:pPr>
-        <w:pStyle w:val="ListParagraph"/>
-        <w:numPr>
-          <w:ilvl w:val="0"/>
-          <w:numId w:val="8"/>
-        </w:numPr>
-        <w:spacing w:after="240"/>
-        <w:ind w:left="360"/>
-      </w:pPr>
-      <w:r>
-        <w:t>System services</w:t>
-      </w:r>
-    </w:p>
-    <w:p>
-      <w:pPr>
-        <w:pStyle w:val="ListParagraph"/>
-        <w:numPr>
-          <w:ilvl w:val="0"/>
-          <w:numId w:val="8"/>
-        </w:numPr>
-        <w:spacing w:after="240"/>
-        <w:ind w:left="360"/>
-      </w:pPr>
-      <w:r>
-        <w:t>User accounts</w:t>
-      </w:r>
-    </w:p>
-    <w:p>
-      <w:pPr>
-        <w:rPr>
-          <w:color w:val="434343"/>
-          <w:sz w:val="28"/>
-          <w:szCs w:val="28"/>
-        </w:rPr>
-      </w:pPr>
-      <w:r>
-        <w:br w:type="page"/>
-      </w:r>
-    </w:p>
-    <w:p>
-      <w:pPr>
-        <w:pStyle w:val="Heading3"/>
-      </w:pPr>
-      <w:r>
-        <w:lastRenderedPageBreak/>
-        <w:t>Issue Reason</w:t>
-      </w:r>
-    </w:p>
-    <w:p>
-      <w:pPr>
-        <w:spacing w:after="240"/>
-      </w:pPr>
-      <w:r>
-        <w:t xml:space="preserve">This is </w:t>
-      </w:r>
-      <w:r>
-        <w:t>the reason for raising this issue</w:t>
-      </w:r>
-      <w:r>
-        <w:t>.</w:t>
-      </w:r>
-      <w:r>
-        <w:t xml:space="preserve"> Issue reasons include:</w:t>
-      </w:r>
-    </w:p>
-    <w:p>
-      <w:pPr>
-        <w:pStyle w:val="ListParagraph"/>
-        <w:numPr>
-          <w:ilvl w:val="0"/>
-          <w:numId w:val="9"/>
-        </w:numPr>
-        <w:spacing w:after="240"/>
-        <w:ind w:left="360"/>
-      </w:pPr>
-      <w:r>
-        <w:t>Debug-only</w:t>
-      </w:r>
-    </w:p>
-    <w:p>
-      <w:pPr>
-        <w:pStyle w:val="ListParagraph"/>
-        <w:numPr>
-          <w:ilvl w:val="0"/>
-          <w:numId w:val="9"/>
-        </w:numPr>
-        <w:spacing w:after="240"/>
-        <w:ind w:left="360"/>
-      </w:pPr>
-      <w:r>
-        <w:t>Out-of-specification</w:t>
-      </w:r>
-    </w:p>
-    <w:p>
-      <w:pPr>
-        <w:pStyle w:val="ListParagraph"/>
-        <w:numPr>
-          <w:ilvl w:val="0"/>
-          <w:numId w:val="9"/>
-        </w:numPr>
-        <w:spacing w:after="240"/>
-        <w:ind w:left="360"/>
-      </w:pPr>
-      <w:r>
-        <w:t>Unused</w:t>
-      </w:r>
-    </w:p>
-    <w:p>
-      <w:pPr>
-        <w:pStyle w:val="Heading3"/>
-      </w:pPr>
-      <w:r>
-        <w:t>Notes</w:t>
-      </w:r>
-    </w:p>
-    <w:p>
-      <w:pPr>
-        <w:rPr>
-          <w:color w:val="FF0000"/>
-          <w:sz w:val="32"/>
-          <w:szCs w:val="32"/>
-        </w:rPr>
-      </w:pPr>
-      <w:bookmarkStart w:id="8" w:name="_Legend"/>
-      <w:bookmarkEnd w:id="8"/>
-      <w:r>
-        <w:t>This is a general notes field.</w:t>
-      </w:r>
-      <w:r>
-        <w:rPr>
-          <w:color w:val="FF0000"/>
-        </w:rPr>
-        <w:br w:type="page"/>
-      </w:r>
-    </w:p>
-    <w:p>
-      <w:pPr>
-        <w:pStyle w:val="Heading2"/>
-        <w:rPr>
-          <w:sz w:val="22"/>
-          <w:szCs w:val="22"/>
-        </w:rPr>
-      </w:pPr>
-      <w:r>
-        <w:lastRenderedPageBreak/>
-        <w:t>Legend</w:t>
-      </w:r>
-    </w:p>
-    <w:p>
-      <w:pPr>
-        <w:spacing w:after="240"/>
-      </w:pPr>
-      <w:r>
-        <w:t xml:space="preserve">The </w:t>
-      </w:r>
-      <w:r>
-        <w:rPr>
-          <w:b/>
-          <w:bCs/>
-        </w:rPr>
-        <w:t>legend</w:t>
-      </w:r>
-      <w:r>
-        <w:t xml:space="preserve"> sheet of the workbook is shown below:</w:t>
-      </w:r>
-    </w:p>
-    <w:p>
-      <w:pPr>
-        <w:spacing w:after="240"/>
-        <w:jc w:val="center"/>
-      </w:pPr>
-      <w:r>
-        <w:rPr>
-          <w:noProof/>
-        </w:rPr>
-        <w:drawing>
-          <wp:inline distT="0" distB="0" distL="0" distR="0" wp14:anchorId="2BF79DA8" wp14:editId="1EF613E8">
-            <wp:extent cx="5943600" cy="3183255"/>
-            <wp:effectExtent l="0" t="0" r="0" b="4445"/>
-            <wp:docPr id="405609356" name="Picture 4" descr="A white sheet with black text&#10;&#10;Description automatically generated"/>
-            <wp:cNvGraphicFramePr>
-              <a:graphicFrameLocks xmlns:a="http://schemas.openxmlformats.org/drawingml/2006/main" noChangeAspect="1"/>
-            </wp:cNvGraphicFramePr>
-            <a:graphic xmlns:a="http://schemas.openxmlformats.org/drawingml/2006/main">
-              <a:graphicData uri="http://schemas.openxmlformats.org/drawingml/2006/picture">
-                <pic:pic xmlns:pic="http://schemas.openxmlformats.org/drawingml/2006/picture">
-                  <pic:nvPicPr>
-                    <pic:cNvPr id="405609356" name="Picture 4" descr="A white sheet with black text&#10;&#10;Description automatically generated"/>
+                    <pic:cNvPr id="809414650" name="Picture 5"/>
                     <pic:cNvPicPr/>
                   </pic:nvPicPr>
                   <pic:blipFill>
@@ -3831,7 +3473,7 @@
                   <pic:spPr>
                     <a:xfrm>
                       <a:off x="0" y="0"/>
-                      <a:ext cx="5943600" cy="3183255"/>
+                      <a:ext cx="5943600" cy="1201248"/>
                     </a:xfrm>
                     <a:prstGeom prst="rect">
                       <a:avLst/>
@@ -3846,8 +3488,334 @@
     </w:p>
     <w:p>
       <w:pPr>
-        <w:spacing w:after="240"/>
-        <w:jc w:val="both"/>
+        <w:pStyle w:val="Heading3"/>
+      </w:pPr>
+      <w:r>
+        <w:t>ID</w:t>
+      </w:r>
+    </w:p>
+    <w:p>
+      <w:pPr>
+        <w:spacing w:after="240"/>
+      </w:pPr>
+      <w:r>
+        <w:t>This is the unique ID of the issue.</w:t>
+      </w:r>
+    </w:p>
+    <w:p>
+      <w:pPr>
+        <w:pStyle w:val="Heading3"/>
+      </w:pPr>
+      <w:r>
+        <w:t>feature</w:t>
+      </w:r>
+      <w:r>
+        <w:t xml:space="preserve"> ID</w:t>
+      </w:r>
+    </w:p>
+    <w:p>
+      <w:pPr>
+        <w:spacing w:after="240"/>
+        <w:jc w:val="both"/>
+      </w:pPr>
+      <w:r>
+        <w:t xml:space="preserve">This is the </w:t>
+      </w:r>
+      <w:r>
+        <w:t xml:space="preserve">unique ID corresponding to the </w:t>
+      </w:r>
+      <w:r>
+        <w:t>feature</w:t>
+      </w:r>
+      <w:r>
+        <w:t xml:space="preserve"> where the issue presents itself</w:t>
+      </w:r>
+      <w:r>
+        <w:t>.</w:t>
+      </w:r>
+    </w:p>
+    <w:p>
+      <w:pPr>
+        <w:pStyle w:val="Heading3"/>
+      </w:pPr>
+      <w:r>
+        <w:t>Issue</w:t>
+      </w:r>
+      <w:r>
+        <w:t xml:space="preserve"> Type</w:t>
+      </w:r>
+    </w:p>
+    <w:p>
+      <w:pPr>
+        <w:spacing w:after="240"/>
+      </w:pPr>
+      <w:r>
+        <w:t xml:space="preserve">This is the type of </w:t>
+      </w:r>
+      <w:r>
+        <w:t>the issue</w:t>
+      </w:r>
+      <w:r>
+        <w:t xml:space="preserve">. </w:t>
+      </w:r>
+      <w:r>
+        <w:t>Issue</w:t>
+      </w:r>
+      <w:r>
+        <w:t xml:space="preserve"> types include:</w:t>
+      </w:r>
+    </w:p>
+    <w:p>
+      <w:pPr>
+        <w:pStyle w:val="ListParagraph"/>
+        <w:numPr>
+          <w:ilvl w:val="0"/>
+          <w:numId w:val="8"/>
+        </w:numPr>
+        <w:spacing w:after="240"/>
+        <w:ind w:left="360"/>
+      </w:pPr>
+      <w:r>
+        <w:t>Data connection lifetime</w:t>
+      </w:r>
+    </w:p>
+    <w:p>
+      <w:pPr>
+        <w:pStyle w:val="ListParagraph"/>
+        <w:numPr>
+          <w:ilvl w:val="0"/>
+          <w:numId w:val="8"/>
+        </w:numPr>
+        <w:spacing w:after="240"/>
+        <w:ind w:left="360"/>
+      </w:pPr>
+      <w:r>
+        <w:t>Data structures</w:t>
+      </w:r>
+    </w:p>
+    <w:p>
+      <w:pPr>
+        <w:pStyle w:val="ListParagraph"/>
+        <w:numPr>
+          <w:ilvl w:val="0"/>
+          <w:numId w:val="8"/>
+        </w:numPr>
+        <w:spacing w:after="240"/>
+        <w:ind w:left="360"/>
+      </w:pPr>
+      <w:r>
+        <w:t>Diagnostics</w:t>
+      </w:r>
+    </w:p>
+    <w:p>
+      <w:pPr>
+        <w:pStyle w:val="ListParagraph"/>
+        <w:numPr>
+          <w:ilvl w:val="0"/>
+          <w:numId w:val="8"/>
+        </w:numPr>
+        <w:spacing w:after="240"/>
+        <w:ind w:left="360"/>
+      </w:pPr>
+      <w:r>
+        <w:t>Features</w:t>
+      </w:r>
+    </w:p>
+    <w:p>
+      <w:pPr>
+        <w:pStyle w:val="ListParagraph"/>
+        <w:numPr>
+          <w:ilvl w:val="0"/>
+          <w:numId w:val="8"/>
+        </w:numPr>
+        <w:spacing w:after="240"/>
+        <w:ind w:left="360"/>
+      </w:pPr>
+      <w:r>
+        <w:t>Memory pressure susceptibility</w:t>
+      </w:r>
+    </w:p>
+    <w:p>
+      <w:pPr>
+        <w:pStyle w:val="ListParagraph"/>
+        <w:numPr>
+          <w:ilvl w:val="0"/>
+          <w:numId w:val="8"/>
+        </w:numPr>
+        <w:spacing w:after="240"/>
+        <w:ind w:left="360"/>
+      </w:pPr>
+      <w:r>
+        <w:t>Ports</w:t>
+      </w:r>
+    </w:p>
+    <w:p>
+      <w:pPr>
+        <w:pStyle w:val="ListParagraph"/>
+        <w:numPr>
+          <w:ilvl w:val="0"/>
+          <w:numId w:val="8"/>
+        </w:numPr>
+        <w:spacing w:after="240"/>
+        <w:ind w:left="360"/>
+      </w:pPr>
+      <w:r>
+        <w:t>Protocols</w:t>
+      </w:r>
+    </w:p>
+    <w:p>
+      <w:pPr>
+        <w:pStyle w:val="ListParagraph"/>
+        <w:numPr>
+          <w:ilvl w:val="0"/>
+          <w:numId w:val="8"/>
+        </w:numPr>
+        <w:spacing w:after="240"/>
+        <w:ind w:left="360"/>
+      </w:pPr>
+      <w:r>
+        <w:t>Remote execution</w:t>
+      </w:r>
+    </w:p>
+    <w:p>
+      <w:pPr>
+        <w:pStyle w:val="ListParagraph"/>
+        <w:numPr>
+          <w:ilvl w:val="0"/>
+          <w:numId w:val="8"/>
+        </w:numPr>
+        <w:spacing w:after="240"/>
+        <w:ind w:left="360"/>
+      </w:pPr>
+      <w:r>
+        <w:t>System services</w:t>
+      </w:r>
+    </w:p>
+    <w:p>
+      <w:pPr>
+        <w:pStyle w:val="ListParagraph"/>
+        <w:numPr>
+          <w:ilvl w:val="0"/>
+          <w:numId w:val="8"/>
+        </w:numPr>
+        <w:spacing w:after="240"/>
+        <w:ind w:left="360"/>
+      </w:pPr>
+      <w:r>
+        <w:t>User accounts</w:t>
+      </w:r>
+    </w:p>
+    <w:p>
+      <w:pPr>
+        <w:pStyle w:val="Heading3"/>
+      </w:pPr>
+      <w:r>
+        <w:t>Issue Reason</w:t>
+      </w:r>
+    </w:p>
+    <w:p>
+      <w:pPr>
+        <w:spacing w:after="240"/>
+      </w:pPr>
+      <w:r>
+        <w:t xml:space="preserve">This is </w:t>
+      </w:r>
+      <w:r>
+        <w:t>the reason for raising this issue</w:t>
+      </w:r>
+      <w:r>
+        <w:t>.</w:t>
+      </w:r>
+      <w:r>
+        <w:t xml:space="preserve"> Issue reasons include:</w:t>
+      </w:r>
+    </w:p>
+    <w:p>
+      <w:pPr>
+        <w:pStyle w:val="ListParagraph"/>
+        <w:numPr>
+          <w:ilvl w:val="0"/>
+          <w:numId w:val="9"/>
+        </w:numPr>
+        <w:spacing w:after="240"/>
+        <w:ind w:left="360"/>
+      </w:pPr>
+      <w:r>
+        <w:t>Debug-only</w:t>
+      </w:r>
+    </w:p>
+    <w:p>
+      <w:pPr>
+        <w:pStyle w:val="ListParagraph"/>
+        <w:numPr>
+          <w:ilvl w:val="0"/>
+          <w:numId w:val="9"/>
+        </w:numPr>
+        <w:spacing w:after="240"/>
+        <w:ind w:left="360"/>
+      </w:pPr>
+      <w:r>
+        <w:t>Out-of-specification</w:t>
+      </w:r>
+    </w:p>
+    <w:p>
+      <w:pPr>
+        <w:pStyle w:val="ListParagraph"/>
+        <w:numPr>
+          <w:ilvl w:val="0"/>
+          <w:numId w:val="9"/>
+        </w:numPr>
+        <w:spacing w:after="240"/>
+        <w:ind w:left="360"/>
+      </w:pPr>
+      <w:r>
+        <w:t>Unused</w:t>
+      </w:r>
+    </w:p>
+    <w:p>
+      <w:pPr>
+        <w:pStyle w:val="Heading3"/>
+      </w:pPr>
+      <w:r>
+        <w:t>Notes</w:t>
+      </w:r>
+    </w:p>
+    <w:p>
+      <w:pPr>
+        <w:rPr>
+          <w:color w:val="FF0000"/>
+          <w:sz w:val="32"/>
+          <w:szCs w:val="32"/>
+        </w:rPr>
+      </w:pPr>
+      <w:bookmarkStart w:id="8" w:name="_Legend"/>
+      <w:bookmarkEnd w:id="8"/>
+      <w:r>
+        <w:t>This is a general notes field.</w:t>
+      </w:r>
+      <w:r>
+        <w:rPr>
+          <w:color w:val="FF0000"/>
+        </w:rPr>
+        <w:br w:type="page"/>
+      </w:r>
+    </w:p>
+    <w:p>
+      <w:pPr>
+        <w:pStyle w:val="Heading2"/>
+        <w:rPr>
+          <w:sz w:val="22"/>
+          <w:szCs w:val="22"/>
+        </w:rPr>
+      </w:pPr>
+      <w:r>
+        <w:lastRenderedPageBreak/>
+        <w:t>Legend</w:t>
+      </w:r>
+    </w:p>
+    <w:p>
+      <w:pPr>
+        <w:spacing w:after="240"/>
       </w:pPr>
       <w:r>
         <w:t xml:space="preserve">The </w:t>
@@ -3860,7 +3828,122 @@
         <w:t>legend</w:t>
       </w:r>
       <w:r>
+        <w:t xml:space="preserve"> sheet of the workbook is shown below:</w:t>
+      </w:r>
+    </w:p>
+    <w:p>
+      <w:pPr>
+        <w:spacing w:after="240"/>
+        <w:jc w:val="center"/>
+      </w:pPr>
+      <w:r>
+        <w:rPr>
+          <w:noProof/>
+        </w:rPr>
+        <w:drawing>
+          <wp:inline distT="0" distB="0" distL="0" distR="0" wp14:anchorId="2BF79DA8" wp14:editId="39D20896">
+            <wp:extent cx="5943600" cy="1676160"/>
+            <wp:effectExtent l="0" t="0" r="0" b="635"/>
+            <wp:docPr id="405609356" name="Picture 4"/>
+            <wp:cNvGraphicFramePr>
+              <a:graphicFrameLocks xmlns:a="http://schemas.openxmlformats.org/drawingml/2006/main" noChangeAspect="1"/>
+            </wp:cNvGraphicFramePr>
+            <a:graphic xmlns:a="http://schemas.openxmlformats.org/drawingml/2006/main">
+              <a:graphicData uri="http://schemas.openxmlformats.org/drawingml/2006/picture">
+                <pic:pic xmlns:pic="http://schemas.openxmlformats.org/drawingml/2006/picture">
+                  <pic:nvPicPr>
+                    <pic:cNvPr id="405609356" name="Picture 4"/>
+                    <pic:cNvPicPr/>
+                  </pic:nvPicPr>
+                  <pic:blipFill>
+                    <a:blip r:embed="rId13"/>
+                    <a:stretch>
+                      <a:fillRect/>
+                    </a:stretch>
+                  </pic:blipFill>
+                  <pic:spPr>
+                    <a:xfrm>
+                      <a:off x="0" y="0"/>
+                      <a:ext cx="5943600" cy="1676160"/>
+                    </a:xfrm>
+                    <a:prstGeom prst="rect">
+                      <a:avLst/>
+                    </a:prstGeom>
+                  </pic:spPr>
+                </pic:pic>
+              </a:graphicData>
+            </a:graphic>
+          </wp:inline>
+        </w:drawing>
+      </w:r>
+    </w:p>
+    <w:p>
+      <w:pPr>
+        <w:spacing w:after="240"/>
+        <w:jc w:val="both"/>
+      </w:pPr>
+      <w:r>
+        <w:t xml:space="preserve">The </w:t>
+      </w:r>
+      <w:r>
+        <w:rPr>
+          <w:b/>
+          <w:bCs/>
+        </w:rPr>
+        <w:t>legend</w:t>
+      </w:r>
+      <w:r>
         <w:t xml:space="preserve"> sheet information is used to make the completion of the document easier by providing dropdown lists for common values. It also ensures that spelling errors do not creep into the generated material.</w:t>
+      </w:r>
+    </w:p>
+    <w:p>
+      <w:pPr>
+        <w:spacing w:after="240"/>
+        <w:ind w:left="810" w:hanging="810"/>
+        <w:jc w:val="both"/>
+      </w:pPr>
+      <w:r>
+        <w:rPr>
+          <w:b/>
+          <w:bCs/>
+          <w:color w:val="0070C0"/>
+        </w:rPr>
+        <w:t>Note</w:t>
+      </w:r>
+      <w:r>
+        <w:rPr>
+          <w:b/>
+          <w:bCs/>
+          <w:color w:val="0070C0"/>
+        </w:rPr>
+        <w:t>:</w:t>
+      </w:r>
+      <w:r>
+        <w:tab/>
+        <w:t xml:space="preserve">The </w:t>
+      </w:r>
+      <w:r>
+        <w:rPr>
+          <w:b/>
+          <w:bCs/>
+        </w:rPr>
+        <w:t>issue notes</w:t>
+      </w:r>
+      <w:r>
+        <w:t xml:space="preserve"> column provides additional information for the </w:t>
+      </w:r>
+      <w:r>
+        <w:rPr>
+          <w:b/>
+          <w:bCs/>
+        </w:rPr>
+        <w:t>issue type</w:t>
+      </w:r>
+      <w:r>
+        <w:t xml:space="preserve"> and is not intended to be used in the issue table itself</w:t>
+      </w:r>
+      <w:r>
+        <w:t>.</w:t>
       </w:r>
     </w:p>
     <w:p>
@@ -4253,12 +4336,11 @@
         </w:rPr>
         <w:br/>
       </w:r>
-      <w:hyperlink r:id="rId13" w:history="1">
+      <w:hyperlink r:id="rId14" w:history="1">
         <w:r>
           <w:rPr>
             <w:rStyle w:val="Hyperlink"/>
-            <w:rFonts w:ascii="Courier New" w:hAnsi="Courier New" w:cs="Courier New"/>
-            <w:b/>
+            <w:rFonts w:cs="Courier New"/>
             <w:bCs/>
             <w:sz w:val="21"/>
             <w:szCs w:val="21"/>
@@ -4307,12 +4389,11 @@
         </w:rPr>
         <w:br/>
       </w:r>
-      <w:hyperlink r:id="rId14" w:history="1">
+      <w:hyperlink r:id="rId15" w:history="1">
         <w:r>
           <w:rPr>
             <w:rStyle w:val="Hyperlink"/>
-            <w:rFonts w:ascii="Courier New" w:hAnsi="Courier New" w:cs="Courier New"/>
-            <w:b/>
+            <w:rFonts w:cs="Courier New"/>
             <w:bCs/>
             <w:sz w:val="21"/>
             <w:szCs w:val="21"/>
@@ -4343,12 +4424,11 @@
       <w:r>
         <w:br/>
       </w:r>
-      <w:hyperlink r:id="rId15" w:history="1">
+      <w:hyperlink r:id="rId16" w:history="1">
         <w:r>
           <w:rPr>
             <w:rStyle w:val="Hyperlink"/>
-            <w:rFonts w:ascii="Courier New" w:hAnsi="Courier New" w:cs="Courier New"/>
-            <w:b/>
+            <w:rFonts w:cs="Courier New"/>
             <w:bCs/>
             <w:sz w:val="21"/>
             <w:szCs w:val="21"/>
@@ -4359,9 +4439,9 @@
     </w:p>
     <w:p/>
     <w:sectPr>
-      <w:footerReference w:type="even" r:id="rId16"/>
-      <w:footerReference w:type="default" r:id="rId17"/>
-      <w:headerReference w:type="first" r:id="rId18"/>
+      <w:footerReference w:type="even" r:id="rId17"/>
+      <w:footerReference w:type="default" r:id="rId18"/>
+      <w:headerReference w:type="first" r:id="rId19"/>
       <w:pgSz w:w="12240" w:h="15840"/>
       <w:pgMar w:top="1440" w:right="1440" w:bottom="1440" w:left="1440" w:header="720" w:footer="720" w:gutter="0"/>
       <w:pgNumType w:start="1"/>
@@ -4373,7 +4453,7 @@
 </file>
 
 <file path=word/endnotes.xml><?xml version="1.0" encoding="utf-8"?>
-<w:endnotes xmlns:wpc="http://schemas.microsoft.com/office/word/2010/wordprocessingCanvas" xmlns:cx="http://schemas.microsoft.com/office/drawing/2014/chartex" xmlns:cx1="http://schemas.microsoft.com/office/drawing/2015/9/8/chartex" xmlns:cx2="http://schemas.microsoft.com/office/drawing/2015/10/21/chartex" xmlns:cx3="http://schemas.microsoft.com/office/drawing/2016/5/9/chartex" xmlns:cx4="http://schemas.microsoft.com/office/drawing/2016/5/10/chartex" xmlns:cx5="http://schemas.microsoft.com/office/drawing/2016/5/11/chartex" xmlns:cx6="http://schemas.microsoft.com/office/drawing/2016/5/12/chartex" xmlns:cx7="http://schemas.microsoft.com/office/drawing/2016/5/13/chartex" xmlns:cx8="http://schemas.microsoft.com/office/drawing/2016/5/14/chartex" xmlns:mc="http://schemas.openxmlformats.org/markup-compatibility/2006" xmlns:aink="http://schemas.microsoft.com/office/drawing/2016/ink" xmlns:am3d="http://schemas.microsoft.com/office/drawing/2017/model3d" xmlns:o="urn:schemas-microsoft-com:office:office" xmlns:oel="http://schemas.microsoft.com/office/2019/extlst" xmlns:r="http://schemas.openxmlformats.org/officeDocument/2006/relationships" xmlns:m="http://schemas.openxmlformats.org/officeDocument/2006/math" xmlns:v="urn:schemas-microsoft-com:vml" xmlns:wp14="http://schemas.microsoft.com/office/word/2010/wordprocessingDrawing" xmlns:wp="http://schemas.openxmlformats.org/drawingml/2006/wordprocessingDrawing" xmlns:w10="urn:schemas-microsoft-com:office:word" xmlns:w="http://schemas.openxmlformats.org/wordprocessingml/2006/main" xmlns:w14="http://schemas.microsoft.com/office/word/2010/wordml" xmlns:w15="http://schemas.microsoft.com/office/word/2012/wordml" xmlns:w16cex="http://schemas.microsoft.com/office/word/2018/wordml/cex" xmlns:w16cid="http://schemas.microsoft.com/office/word/2016/wordml/cid" xmlns:w16="http://schemas.microsoft.com/office/word/2018/wordml" xmlns:w16du="http://schemas.microsoft.com/office/word/2023/wordml/word16du" xmlns:w16sdtdh="http://schemas.microsoft.com/office/word/2020/wordml/sdtdatahash" xmlns:w16se="http://schemas.microsoft.com/office/word/2015/wordml/symex" xmlns:wpg="http://schemas.microsoft.com/office/word/2010/wordprocessingGroup" xmlns:wpi="http://schemas.microsoft.com/office/word/2010/wordprocessingInk" xmlns:wne="http://schemas.microsoft.com/office/word/2006/wordml" xmlns:wps="http://schemas.microsoft.com/office/word/2010/wordprocessingShape" mc:Ignorable="w14 w15 w16se w16cid w16 w16cex w16sdtdh w16du wp14">
+<w:endnotes xmlns:wpc="http://schemas.microsoft.com/office/word/2010/wordprocessingCanvas" xmlns:cx="http://schemas.microsoft.com/office/drawing/2014/chartex" xmlns:cx1="http://schemas.microsoft.com/office/drawing/2015/9/8/chartex" xmlns:cx2="http://schemas.microsoft.com/office/drawing/2015/10/21/chartex" xmlns:cx3="http://schemas.microsoft.com/office/drawing/2016/5/9/chartex" xmlns:cx4="http://schemas.microsoft.com/office/drawing/2016/5/10/chartex" xmlns:cx5="http://schemas.microsoft.com/office/drawing/2016/5/11/chartex" xmlns:cx6="http://schemas.microsoft.com/office/drawing/2016/5/12/chartex" xmlns:cx7="http://schemas.microsoft.com/office/drawing/2016/5/13/chartex" xmlns:cx8="http://schemas.microsoft.com/office/drawing/2016/5/14/chartex" xmlns:mc="http://schemas.openxmlformats.org/markup-compatibility/2006" xmlns:aink="http://schemas.microsoft.com/office/drawing/2016/ink" xmlns:am3d="http://schemas.microsoft.com/office/drawing/2017/model3d" xmlns:o="urn:schemas-microsoft-com:office:office" xmlns:oel="http://schemas.microsoft.com/office/2019/extlst" xmlns:r="http://schemas.openxmlformats.org/officeDocument/2006/relationships" xmlns:m="http://schemas.openxmlformats.org/officeDocument/2006/math" xmlns:v="urn:schemas-microsoft-com:vml" xmlns:wp14="http://schemas.microsoft.com/office/word/2010/wordprocessingDrawing" xmlns:wp="http://schemas.openxmlformats.org/drawingml/2006/wordprocessingDrawing" xmlns:w10="urn:schemas-microsoft-com:office:word" xmlns:w="http://schemas.openxmlformats.org/wordprocessingml/2006/main" xmlns:w14="http://schemas.microsoft.com/office/word/2010/wordml" xmlns:w15="http://schemas.microsoft.com/office/word/2012/wordml" xmlns:w16cex="http://schemas.microsoft.com/office/word/2018/wordml/cex" xmlns:w16cid="http://schemas.microsoft.com/office/word/2016/wordml/cid" xmlns:w16="http://schemas.microsoft.com/office/word/2018/wordml" xmlns:w16du="http://schemas.microsoft.com/office/word/2023/wordml/word16du" xmlns:w16sdtdh="http://schemas.microsoft.com/office/word/2020/wordml/sdtdatahash" xmlns:w16sdtfl="http://schemas.microsoft.com/office/word/2024/wordml/sdtformatlock" xmlns:w16se="http://schemas.microsoft.com/office/word/2015/wordml/symex" xmlns:wpg="http://schemas.microsoft.com/office/word/2010/wordprocessingGroup" xmlns:wpi="http://schemas.microsoft.com/office/word/2010/wordprocessingInk" xmlns:wne="http://schemas.microsoft.com/office/word/2006/wordml" xmlns:wps="http://schemas.microsoft.com/office/word/2010/wordprocessingShape" mc:Ignorable="w14 w15 w16se w16cid w16 w16cex w16sdtdh w16sdtfl w16du wp14">
   <w:endnote w:type="separator" w:id="-1">
     <w:p>
       <w:pPr>
@@ -4398,7 +4478,7 @@
 </file>
 
 <file path=word/footer1.xml><?xml version="1.0" encoding="utf-8"?>
-<w:ftr xmlns:wpc="http://schemas.microsoft.com/office/word/2010/wordprocessingCanvas" xmlns:cx="http://schemas.microsoft.com/office/drawing/2014/chartex" xmlns:cx1="http://schemas.microsoft.com/office/drawing/2015/9/8/chartex" xmlns:cx2="http://schemas.microsoft.com/office/drawing/2015/10/21/chartex" xmlns:cx3="http://schemas.microsoft.com/office/drawing/2016/5/9/chartex" xmlns:cx4="http://schemas.microsoft.com/office/drawing/2016/5/10/chartex" xmlns:cx5="http://schemas.microsoft.com/office/drawing/2016/5/11/chartex" xmlns:cx6="http://schemas.microsoft.com/office/drawing/2016/5/12/chartex" xmlns:cx7="http://schemas.microsoft.com/office/drawing/2016/5/13/chartex" xmlns:cx8="http://schemas.microsoft.com/office/drawing/2016/5/14/chartex" xmlns:mc="http://schemas.openxmlformats.org/markup-compatibility/2006" xmlns:aink="http://schemas.microsoft.com/office/drawing/2016/ink" xmlns:am3d="http://schemas.microsoft.com/office/drawing/2017/model3d" xmlns:o="urn:schemas-microsoft-com:office:office" xmlns:oel="http://schemas.microsoft.com/office/2019/extlst" xmlns:r="http://schemas.openxmlformats.org/officeDocument/2006/relationships" xmlns:m="http://schemas.openxmlformats.org/officeDocument/2006/math" xmlns:v="urn:schemas-microsoft-com:vml" xmlns:wp14="http://schemas.microsoft.com/office/word/2010/wordprocessingDrawing" xmlns:wp="http://schemas.openxmlformats.org/drawingml/2006/wordprocessingDrawing" xmlns:w10="urn:schemas-microsoft-com:office:word" xmlns:w="http://schemas.openxmlformats.org/wordprocessingml/2006/main" xmlns:w14="http://schemas.microsoft.com/office/word/2010/wordml" xmlns:w15="http://schemas.microsoft.com/office/word/2012/wordml" xmlns:w16cex="http://schemas.microsoft.com/office/word/2018/wordml/cex" xmlns:w16cid="http://schemas.microsoft.com/office/word/2016/wordml/cid" xmlns:w16="http://schemas.microsoft.com/office/word/2018/wordml" xmlns:w16du="http://schemas.microsoft.com/office/word/2023/wordml/word16du" xmlns:w16sdtdh="http://schemas.microsoft.com/office/word/2020/wordml/sdtdatahash" xmlns:w16se="http://schemas.microsoft.com/office/word/2015/wordml/symex" xmlns:wpg="http://schemas.microsoft.com/office/word/2010/wordprocessingGroup" xmlns:wpi="http://schemas.microsoft.com/office/word/2010/wordprocessingInk" xmlns:wne="http://schemas.microsoft.com/office/word/2006/wordml" xmlns:wps="http://schemas.microsoft.com/office/word/2010/wordprocessingShape" mc:Ignorable="w14 w15 w16se w16cid w16 w16cex w16sdtdh w16du wp14">
+<w:ftr xmlns:wpc="http://schemas.microsoft.com/office/word/2010/wordprocessingCanvas" xmlns:cx="http://schemas.microsoft.com/office/drawing/2014/chartex" xmlns:cx1="http://schemas.microsoft.com/office/drawing/2015/9/8/chartex" xmlns:cx2="http://schemas.microsoft.com/office/drawing/2015/10/21/chartex" xmlns:cx3="http://schemas.microsoft.com/office/drawing/2016/5/9/chartex" xmlns:cx4="http://schemas.microsoft.com/office/drawing/2016/5/10/chartex" xmlns:cx5="http://schemas.microsoft.com/office/drawing/2016/5/11/chartex" xmlns:cx6="http://schemas.microsoft.com/office/drawing/2016/5/12/chartex" xmlns:cx7="http://schemas.microsoft.com/office/drawing/2016/5/13/chartex" xmlns:cx8="http://schemas.microsoft.com/office/drawing/2016/5/14/chartex" xmlns:mc="http://schemas.openxmlformats.org/markup-compatibility/2006" xmlns:aink="http://schemas.microsoft.com/office/drawing/2016/ink" xmlns:am3d="http://schemas.microsoft.com/office/drawing/2017/model3d" xmlns:o="urn:schemas-microsoft-com:office:office" xmlns:oel="http://schemas.microsoft.com/office/2019/extlst" xmlns:r="http://schemas.openxmlformats.org/officeDocument/2006/relationships" xmlns:m="http://schemas.openxmlformats.org/officeDocument/2006/math" xmlns:v="urn:schemas-microsoft-com:vml" xmlns:wp14="http://schemas.microsoft.com/office/word/2010/wordprocessingDrawing" xmlns:wp="http://schemas.openxmlformats.org/drawingml/2006/wordprocessingDrawing" xmlns:w10="urn:schemas-microsoft-com:office:word" xmlns:w="http://schemas.openxmlformats.org/wordprocessingml/2006/main" xmlns:w14="http://schemas.microsoft.com/office/word/2010/wordml" xmlns:w15="http://schemas.microsoft.com/office/word/2012/wordml" xmlns:w16cex="http://schemas.microsoft.com/office/word/2018/wordml/cex" xmlns:w16cid="http://schemas.microsoft.com/office/word/2016/wordml/cid" xmlns:w16="http://schemas.microsoft.com/office/word/2018/wordml" xmlns:w16du="http://schemas.microsoft.com/office/word/2023/wordml/word16du" xmlns:w16sdtdh="http://schemas.microsoft.com/office/word/2020/wordml/sdtdatahash" xmlns:w16sdtfl="http://schemas.microsoft.com/office/word/2024/wordml/sdtformatlock" xmlns:w16se="http://schemas.microsoft.com/office/word/2015/wordml/symex" xmlns:wpg="http://schemas.microsoft.com/office/word/2010/wordprocessingGroup" xmlns:wpi="http://schemas.microsoft.com/office/word/2010/wordprocessingInk" xmlns:wne="http://schemas.microsoft.com/office/word/2006/wordml" xmlns:wps="http://schemas.microsoft.com/office/word/2010/wordprocessingShape" mc:Ignorable="w14 w15 w16se w16cid w16 w16cex w16sdtdh w16sdtfl w16du wp14">
   <w:sdt>
     <w:sdtPr>
       <w:rPr>
@@ -4450,7 +4530,7 @@
 </file>
 
 <file path=word/footer2.xml><?xml version="1.0" encoding="utf-8"?>
-<w:ftr xmlns:wpc="http://schemas.microsoft.com/office/word/2010/wordprocessingCanvas" xmlns:cx="http://schemas.microsoft.com/office/drawing/2014/chartex" xmlns:cx1="http://schemas.microsoft.com/office/drawing/2015/9/8/chartex" xmlns:cx2="http://schemas.microsoft.com/office/drawing/2015/10/21/chartex" xmlns:cx3="http://schemas.microsoft.com/office/drawing/2016/5/9/chartex" xmlns:cx4="http://schemas.microsoft.com/office/drawing/2016/5/10/chartex" xmlns:cx5="http://schemas.microsoft.com/office/drawing/2016/5/11/chartex" xmlns:cx6="http://schemas.microsoft.com/office/drawing/2016/5/12/chartex" xmlns:cx7="http://schemas.microsoft.com/office/drawing/2016/5/13/chartex" xmlns:cx8="http://schemas.microsoft.com/office/drawing/2016/5/14/chartex" xmlns:mc="http://schemas.openxmlformats.org/markup-compatibility/2006" xmlns:aink="http://schemas.microsoft.com/office/drawing/2016/ink" xmlns:am3d="http://schemas.microsoft.com/office/drawing/2017/model3d" xmlns:o="urn:schemas-microsoft-com:office:office" xmlns:oel="http://schemas.microsoft.com/office/2019/extlst" xmlns:r="http://schemas.openxmlformats.org/officeDocument/2006/relationships" xmlns:m="http://schemas.openxmlformats.org/officeDocument/2006/math" xmlns:v="urn:schemas-microsoft-com:vml" xmlns:wp14="http://schemas.microsoft.com/office/word/2010/wordprocessingDrawing" xmlns:wp="http://schemas.openxmlformats.org/drawingml/2006/wordprocessingDrawing" xmlns:w10="urn:schemas-microsoft-com:office:word" xmlns:w="http://schemas.openxmlformats.org/wordprocessingml/2006/main" xmlns:w14="http://schemas.microsoft.com/office/word/2010/wordml" xmlns:w15="http://schemas.microsoft.com/office/word/2012/wordml" xmlns:w16cex="http://schemas.microsoft.com/office/word/2018/wordml/cex" xmlns:w16cid="http://schemas.microsoft.com/office/word/2016/wordml/cid" xmlns:w16="http://schemas.microsoft.com/office/word/2018/wordml" xmlns:w16du="http://schemas.microsoft.com/office/word/2023/wordml/word16du" xmlns:w16sdtdh="http://schemas.microsoft.com/office/word/2020/wordml/sdtdatahash" xmlns:w16se="http://schemas.microsoft.com/office/word/2015/wordml/symex" xmlns:wpg="http://schemas.microsoft.com/office/word/2010/wordprocessingGroup" xmlns:wpi="http://schemas.microsoft.com/office/word/2010/wordprocessingInk" xmlns:wne="http://schemas.microsoft.com/office/word/2006/wordml" xmlns:wps="http://schemas.microsoft.com/office/word/2010/wordprocessingShape" mc:Ignorable="w14 w15 w16se w16cid w16 w16cex w16sdtdh w16du wp14">
+<w:ftr xmlns:wpc="http://schemas.microsoft.com/office/word/2010/wordprocessingCanvas" xmlns:cx="http://schemas.microsoft.com/office/drawing/2014/chartex" xmlns:cx1="http://schemas.microsoft.com/office/drawing/2015/9/8/chartex" xmlns:cx2="http://schemas.microsoft.com/office/drawing/2015/10/21/chartex" xmlns:cx3="http://schemas.microsoft.com/office/drawing/2016/5/9/chartex" xmlns:cx4="http://schemas.microsoft.com/office/drawing/2016/5/10/chartex" xmlns:cx5="http://schemas.microsoft.com/office/drawing/2016/5/11/chartex" xmlns:cx6="http://schemas.microsoft.com/office/drawing/2016/5/12/chartex" xmlns:cx7="http://schemas.microsoft.com/office/drawing/2016/5/13/chartex" xmlns:cx8="http://schemas.microsoft.com/office/drawing/2016/5/14/chartex" xmlns:mc="http://schemas.openxmlformats.org/markup-compatibility/2006" xmlns:aink="http://schemas.microsoft.com/office/drawing/2016/ink" xmlns:am3d="http://schemas.microsoft.com/office/drawing/2017/model3d" xmlns:o="urn:schemas-microsoft-com:office:office" xmlns:oel="http://schemas.microsoft.com/office/2019/extlst" xmlns:r="http://schemas.openxmlformats.org/officeDocument/2006/relationships" xmlns:m="http://schemas.openxmlformats.org/officeDocument/2006/math" xmlns:v="urn:schemas-microsoft-com:vml" xmlns:wp14="http://schemas.microsoft.com/office/word/2010/wordprocessingDrawing" xmlns:wp="http://schemas.openxmlformats.org/drawingml/2006/wordprocessingDrawing" xmlns:w10="urn:schemas-microsoft-com:office:word" xmlns:w="http://schemas.openxmlformats.org/wordprocessingml/2006/main" xmlns:w14="http://schemas.microsoft.com/office/word/2010/wordml" xmlns:w15="http://schemas.microsoft.com/office/word/2012/wordml" xmlns:w16cex="http://schemas.microsoft.com/office/word/2018/wordml/cex" xmlns:w16cid="http://schemas.microsoft.com/office/word/2016/wordml/cid" xmlns:w16="http://schemas.microsoft.com/office/word/2018/wordml" xmlns:w16du="http://schemas.microsoft.com/office/word/2023/wordml/word16du" xmlns:w16sdtdh="http://schemas.microsoft.com/office/word/2020/wordml/sdtdatahash" xmlns:w16sdtfl="http://schemas.microsoft.com/office/word/2024/wordml/sdtformatlock" xmlns:w16se="http://schemas.microsoft.com/office/word/2015/wordml/symex" xmlns:wpg="http://schemas.microsoft.com/office/word/2010/wordprocessingGroup" xmlns:wpi="http://schemas.microsoft.com/office/word/2010/wordprocessingInk" xmlns:wne="http://schemas.microsoft.com/office/word/2006/wordml" xmlns:wps="http://schemas.microsoft.com/office/word/2010/wordprocessingShape" mc:Ignorable="w14 w15 w16se w16cid w16 w16cex w16sdtdh w16sdtfl w16du wp14">
   <w:sdt>
     <w:sdtPr>
       <w:rPr>
@@ -4515,7 +4595,7 @@
 </file>
 
 <file path=word/footnotes.xml><?xml version="1.0" encoding="utf-8"?>
-<w:footnotes xmlns:wpc="http://schemas.microsoft.com/office/word/2010/wordprocessingCanvas" xmlns:cx="http://schemas.microsoft.com/office/drawing/2014/chartex" xmlns:cx1="http://schemas.microsoft.com/office/drawing/2015/9/8/chartex" xmlns:cx2="http://schemas.microsoft.com/office/drawing/2015/10/21/chartex" xmlns:cx3="http://schemas.microsoft.com/office/drawing/2016/5/9/chartex" xmlns:cx4="http://schemas.microsoft.com/office/drawing/2016/5/10/chartex" xmlns:cx5="http://schemas.microsoft.com/office/drawing/2016/5/11/chartex" xmlns:cx6="http://schemas.microsoft.com/office/drawing/2016/5/12/chartex" xmlns:cx7="http://schemas.microsoft.com/office/drawing/2016/5/13/chartex" xmlns:cx8="http://schemas.microsoft.com/office/drawing/2016/5/14/chartex" xmlns:mc="http://schemas.openxmlformats.org/markup-compatibility/2006" xmlns:aink="http://schemas.microsoft.com/office/drawing/2016/ink" xmlns:am3d="http://schemas.microsoft.com/office/drawing/2017/model3d" xmlns:o="urn:schemas-microsoft-com:office:office" xmlns:oel="http://schemas.microsoft.com/office/2019/extlst" xmlns:r="http://schemas.openxmlformats.org/officeDocument/2006/relationships" xmlns:m="http://schemas.openxmlformats.org/officeDocument/2006/math" xmlns:v="urn:schemas-microsoft-com:vml" xmlns:wp14="http://schemas.microsoft.com/office/word/2010/wordprocessingDrawing" xmlns:wp="http://schemas.openxmlformats.org/drawingml/2006/wordprocessingDrawing" xmlns:w10="urn:schemas-microsoft-com:office:word" xmlns:w="http://schemas.openxmlformats.org/wordprocessingml/2006/main" xmlns:w14="http://schemas.microsoft.com/office/word/2010/wordml" xmlns:w15="http://schemas.microsoft.com/office/word/2012/wordml" xmlns:w16cex="http://schemas.microsoft.com/office/word/2018/wordml/cex" xmlns:w16cid="http://schemas.microsoft.com/office/word/2016/wordml/cid" xmlns:w16="http://schemas.microsoft.com/office/word/2018/wordml" xmlns:w16du="http://schemas.microsoft.com/office/word/2023/wordml/word16du" xmlns:w16sdtdh="http://schemas.microsoft.com/office/word/2020/wordml/sdtdatahash" xmlns:w16se="http://schemas.microsoft.com/office/word/2015/wordml/symex" xmlns:wpg="http://schemas.microsoft.com/office/word/2010/wordprocessingGroup" xmlns:wpi="http://schemas.microsoft.com/office/word/2010/wordprocessingInk" xmlns:wne="http://schemas.microsoft.com/office/word/2006/wordml" xmlns:wps="http://schemas.microsoft.com/office/word/2010/wordprocessingShape" mc:Ignorable="w14 w15 w16se w16cid w16 w16cex w16sdtdh w16du wp14">
+<w:footnotes xmlns:wpc="http://schemas.microsoft.com/office/word/2010/wordprocessingCanvas" xmlns:cx="http://schemas.microsoft.com/office/drawing/2014/chartex" xmlns:cx1="http://schemas.microsoft.com/office/drawing/2015/9/8/chartex" xmlns:cx2="http://schemas.microsoft.com/office/drawing/2015/10/21/chartex" xmlns:cx3="http://schemas.microsoft.com/office/drawing/2016/5/9/chartex" xmlns:cx4="http://schemas.microsoft.com/office/drawing/2016/5/10/chartex" xmlns:cx5="http://schemas.microsoft.com/office/drawing/2016/5/11/chartex" xmlns:cx6="http://schemas.microsoft.com/office/drawing/2016/5/12/chartex" xmlns:cx7="http://schemas.microsoft.com/office/drawing/2016/5/13/chartex" xmlns:cx8="http://schemas.microsoft.com/office/drawing/2016/5/14/chartex" xmlns:mc="http://schemas.openxmlformats.org/markup-compatibility/2006" xmlns:aink="http://schemas.microsoft.com/office/drawing/2016/ink" xmlns:am3d="http://schemas.microsoft.com/office/drawing/2017/model3d" xmlns:o="urn:schemas-microsoft-com:office:office" xmlns:oel="http://schemas.microsoft.com/office/2019/extlst" xmlns:r="http://schemas.openxmlformats.org/officeDocument/2006/relationships" xmlns:m="http://schemas.openxmlformats.org/officeDocument/2006/math" xmlns:v="urn:schemas-microsoft-com:vml" xmlns:wp14="http://schemas.microsoft.com/office/word/2010/wordprocessingDrawing" xmlns:wp="http://schemas.openxmlformats.org/drawingml/2006/wordprocessingDrawing" xmlns:w10="urn:schemas-microsoft-com:office:word" xmlns:w="http://schemas.openxmlformats.org/wordprocessingml/2006/main" xmlns:w14="http://schemas.microsoft.com/office/word/2010/wordml" xmlns:w15="http://schemas.microsoft.com/office/word/2012/wordml" xmlns:w16cex="http://schemas.microsoft.com/office/word/2018/wordml/cex" xmlns:w16cid="http://schemas.microsoft.com/office/word/2016/wordml/cid" xmlns:w16="http://schemas.microsoft.com/office/word/2018/wordml" xmlns:w16du="http://schemas.microsoft.com/office/word/2023/wordml/word16du" xmlns:w16sdtdh="http://schemas.microsoft.com/office/word/2020/wordml/sdtdatahash" xmlns:w16sdtfl="http://schemas.microsoft.com/office/word/2024/wordml/sdtformatlock" xmlns:w16se="http://schemas.microsoft.com/office/word/2015/wordml/symex" xmlns:wpg="http://schemas.microsoft.com/office/word/2010/wordprocessingGroup" xmlns:wpi="http://schemas.microsoft.com/office/word/2010/wordprocessingInk" xmlns:wne="http://schemas.microsoft.com/office/word/2006/wordml" xmlns:wps="http://schemas.microsoft.com/office/word/2010/wordprocessingShape" mc:Ignorable="w14 w15 w16se w16cid w16 w16cex w16sdtdh w16sdtfl w16du wp14">
   <w:footnote w:type="separator" w:id="-1">
     <w:p>
       <w:pPr>
@@ -4540,7 +4620,7 @@
 </file>
 
 <file path=word/header1.xml><?xml version="1.0" encoding="utf-8"?>
-<w:hdr xmlns:wpc="http://schemas.microsoft.com/office/word/2010/wordprocessingCanvas" xmlns:cx="http://schemas.microsoft.com/office/drawing/2014/chartex" xmlns:cx1="http://schemas.microsoft.com/office/drawing/2015/9/8/chartex" xmlns:cx2="http://schemas.microsoft.com/office/drawing/2015/10/21/chartex" xmlns:cx3="http://schemas.microsoft.com/office/drawing/2016/5/9/chartex" xmlns:cx4="http://schemas.microsoft.com/office/drawing/2016/5/10/chartex" xmlns:cx5="http://schemas.microsoft.com/office/drawing/2016/5/11/chartex" xmlns:cx6="http://schemas.microsoft.com/office/drawing/2016/5/12/chartex" xmlns:cx7="http://schemas.microsoft.com/office/drawing/2016/5/13/chartex" xmlns:cx8="http://schemas.microsoft.com/office/drawing/2016/5/14/chartex" xmlns:mc="http://schemas.openxmlformats.org/markup-compatibility/2006" xmlns:aink="http://schemas.microsoft.com/office/drawing/2016/ink" xmlns:am3d="http://schemas.microsoft.com/office/drawing/2017/model3d" xmlns:o="urn:schemas-microsoft-com:office:office" xmlns:oel="http://schemas.microsoft.com/office/2019/extlst" xmlns:r="http://schemas.openxmlformats.org/officeDocument/2006/relationships" xmlns:m="http://schemas.openxmlformats.org/officeDocument/2006/math" xmlns:v="urn:schemas-microsoft-com:vml" xmlns:wp14="http://schemas.microsoft.com/office/word/2010/wordprocessingDrawing" xmlns:wp="http://schemas.openxmlformats.org/drawingml/2006/wordprocessingDrawing" xmlns:w10="urn:schemas-microsoft-com:office:word" xmlns:w="http://schemas.openxmlformats.org/wordprocessingml/2006/main" xmlns:w14="http://schemas.microsoft.com/office/word/2010/wordml" xmlns:w15="http://schemas.microsoft.com/office/word/2012/wordml" xmlns:w16cex="http://schemas.microsoft.com/office/word/2018/wordml/cex" xmlns:w16cid="http://schemas.microsoft.com/office/word/2016/wordml/cid" xmlns:w16="http://schemas.microsoft.com/office/word/2018/wordml" xmlns:w16du="http://schemas.microsoft.com/office/word/2023/wordml/word16du" xmlns:w16sdtdh="http://schemas.microsoft.com/office/word/2020/wordml/sdtdatahash" xmlns:w16se="http://schemas.microsoft.com/office/word/2015/wordml/symex" xmlns:wpg="http://schemas.microsoft.com/office/word/2010/wordprocessingGroup" xmlns:wpi="http://schemas.microsoft.com/office/word/2010/wordprocessingInk" xmlns:wne="http://schemas.microsoft.com/office/word/2006/wordml" xmlns:wps="http://schemas.microsoft.com/office/word/2010/wordprocessingShape" mc:Ignorable="w14 w15 w16se w16cid w16 w16cex w16sdtdh w16du wp14">
+<w:hdr xmlns:wpc="http://schemas.microsoft.com/office/word/2010/wordprocessingCanvas" xmlns:cx="http://schemas.microsoft.com/office/drawing/2014/chartex" xmlns:cx1="http://schemas.microsoft.com/office/drawing/2015/9/8/chartex" xmlns:cx2="http://schemas.microsoft.com/office/drawing/2015/10/21/chartex" xmlns:cx3="http://schemas.microsoft.com/office/drawing/2016/5/9/chartex" xmlns:cx4="http://schemas.microsoft.com/office/drawing/2016/5/10/chartex" xmlns:cx5="http://schemas.microsoft.com/office/drawing/2016/5/11/chartex" xmlns:cx6="http://schemas.microsoft.com/office/drawing/2016/5/12/chartex" xmlns:cx7="http://schemas.microsoft.com/office/drawing/2016/5/13/chartex" xmlns:cx8="http://schemas.microsoft.com/office/drawing/2016/5/14/chartex" xmlns:mc="http://schemas.openxmlformats.org/markup-compatibility/2006" xmlns:aink="http://schemas.microsoft.com/office/drawing/2016/ink" xmlns:am3d="http://schemas.microsoft.com/office/drawing/2017/model3d" xmlns:o="urn:schemas-microsoft-com:office:office" xmlns:oel="http://schemas.microsoft.com/office/2019/extlst" xmlns:r="http://schemas.openxmlformats.org/officeDocument/2006/relationships" xmlns:m="http://schemas.openxmlformats.org/officeDocument/2006/math" xmlns:v="urn:schemas-microsoft-com:vml" xmlns:wp14="http://schemas.microsoft.com/office/word/2010/wordprocessingDrawing" xmlns:wp="http://schemas.openxmlformats.org/drawingml/2006/wordprocessingDrawing" xmlns:w10="urn:schemas-microsoft-com:office:word" xmlns:w="http://schemas.openxmlformats.org/wordprocessingml/2006/main" xmlns:w14="http://schemas.microsoft.com/office/word/2010/wordml" xmlns:w15="http://schemas.microsoft.com/office/word/2012/wordml" xmlns:w16cex="http://schemas.microsoft.com/office/word/2018/wordml/cex" xmlns:w16cid="http://schemas.microsoft.com/office/word/2016/wordml/cid" xmlns:w16="http://schemas.microsoft.com/office/word/2018/wordml" xmlns:w16du="http://schemas.microsoft.com/office/word/2023/wordml/word16du" xmlns:w16sdtdh="http://schemas.microsoft.com/office/word/2020/wordml/sdtdatahash" xmlns:w16sdtfl="http://schemas.microsoft.com/office/word/2024/wordml/sdtformatlock" xmlns:w16se="http://schemas.microsoft.com/office/word/2015/wordml/symex" xmlns:wpg="http://schemas.microsoft.com/office/word/2010/wordprocessingGroup" xmlns:wpi="http://schemas.microsoft.com/office/word/2010/wordprocessingInk" xmlns:wne="http://schemas.microsoft.com/office/word/2006/wordml" xmlns:wps="http://schemas.microsoft.com/office/word/2010/wordprocessingShape" mc:Ignorable="w14 w15 w16se w16cid w16 w16cex w16sdtdh w16sdtfl w16du wp14">
   <w:p>
     <w:pPr>
       <w:pStyle w:val="Header"/>
@@ -4563,7 +4643,7 @@
 </file>
 
 <file path=word/numbering.xml><?xml version="1.0" encoding="utf-8"?>
-<w:numbering xmlns:wpc="http://schemas.microsoft.com/office/word/2010/wordprocessingCanvas" xmlns:cx="http://schemas.microsoft.com/office/drawing/2014/chartex" xmlns:cx1="http://schemas.microsoft.com/office/drawing/2015/9/8/chartex" xmlns:cx2="http://schemas.microsoft.com/office/drawing/2015/10/21/chartex" xmlns:cx3="http://schemas.microsoft.com/office/drawing/2016/5/9/chartex" xmlns:cx4="http://schemas.microsoft.com/office/drawing/2016/5/10/chartex" xmlns:cx5="http://schemas.microsoft.com/office/drawing/2016/5/11/chartex" xmlns:cx6="http://schemas.microsoft.com/office/drawing/2016/5/12/chartex" xmlns:cx7="http://schemas.microsoft.com/office/drawing/2016/5/13/chartex" xmlns:cx8="http://schemas.microsoft.com/office/drawing/2016/5/14/chartex" xmlns:mc="http://schemas.openxmlformats.org/markup-compatibility/2006" xmlns:aink="http://schemas.microsoft.com/office/drawing/2016/ink" xmlns:am3d="http://schemas.microsoft.com/office/drawing/2017/model3d" xmlns:o="urn:schemas-microsoft-com:office:office" xmlns:oel="http://schemas.microsoft.com/office/2019/extlst" xmlns:r="http://schemas.openxmlformats.org/officeDocument/2006/relationships" xmlns:m="http://schemas.openxmlformats.org/officeDocument/2006/math" xmlns:v="urn:schemas-microsoft-com:vml" xmlns:wp14="http://schemas.microsoft.com/office/word/2010/wordprocessingDrawing" xmlns:wp="http://schemas.openxmlformats.org/drawingml/2006/wordprocessingDrawing" xmlns:w10="urn:schemas-microsoft-com:office:word" xmlns:w="http://schemas.openxmlformats.org/wordprocessingml/2006/main" xmlns:w14="http://schemas.microsoft.com/office/word/2010/wordml" xmlns:w15="http://schemas.microsoft.com/office/word/2012/wordml" xmlns:w16cex="http://schemas.microsoft.com/office/word/2018/wordml/cex" xmlns:w16cid="http://schemas.microsoft.com/office/word/2016/wordml/cid" xmlns:w16="http://schemas.microsoft.com/office/word/2018/wordml" xmlns:w16du="http://schemas.microsoft.com/office/word/2023/wordml/word16du" xmlns:w16sdtdh="http://schemas.microsoft.com/office/word/2020/wordml/sdtdatahash" xmlns:w16se="http://schemas.microsoft.com/office/word/2015/wordml/symex" xmlns:wpg="http://schemas.microsoft.com/office/word/2010/wordprocessingGroup" xmlns:wpi="http://schemas.microsoft.com/office/word/2010/wordprocessingInk" xmlns:wne="http://schemas.microsoft.com/office/word/2006/wordml" xmlns:wps="http://schemas.microsoft.com/office/word/2010/wordprocessingShape" mc:Ignorable="w14 w15 w16se w16cid w16 w16cex w16sdtdh w16du wp14">
+<w:numbering xmlns:wpc="http://schemas.microsoft.com/office/word/2010/wordprocessingCanvas" xmlns:cx="http://schemas.microsoft.com/office/drawing/2014/chartex" xmlns:cx1="http://schemas.microsoft.com/office/drawing/2015/9/8/chartex" xmlns:cx2="http://schemas.microsoft.com/office/drawing/2015/10/21/chartex" xmlns:cx3="http://schemas.microsoft.com/office/drawing/2016/5/9/chartex" xmlns:cx4="http://schemas.microsoft.com/office/drawing/2016/5/10/chartex" xmlns:cx5="http://schemas.microsoft.com/office/drawing/2016/5/11/chartex" xmlns:cx6="http://schemas.microsoft.com/office/drawing/2016/5/12/chartex" xmlns:cx7="http://schemas.microsoft.com/office/drawing/2016/5/13/chartex" xmlns:cx8="http://schemas.microsoft.com/office/drawing/2016/5/14/chartex" xmlns:mc="http://schemas.openxmlformats.org/markup-compatibility/2006" xmlns:aink="http://schemas.microsoft.com/office/drawing/2016/ink" xmlns:am3d="http://schemas.microsoft.com/office/drawing/2017/model3d" xmlns:o="urn:schemas-microsoft-com:office:office" xmlns:oel="http://schemas.microsoft.com/office/2019/extlst" xmlns:r="http://schemas.openxmlformats.org/officeDocument/2006/relationships" xmlns:m="http://schemas.openxmlformats.org/officeDocument/2006/math" xmlns:v="urn:schemas-microsoft-com:vml" xmlns:wp14="http://schemas.microsoft.com/office/word/2010/wordprocessingDrawing" xmlns:wp="http://schemas.openxmlformats.org/drawingml/2006/wordprocessingDrawing" xmlns:w10="urn:schemas-microsoft-com:office:word" xmlns:w="http://schemas.openxmlformats.org/wordprocessingml/2006/main" xmlns:w14="http://schemas.microsoft.com/office/word/2010/wordml" xmlns:w15="http://schemas.microsoft.com/office/word/2012/wordml" xmlns:w16cex="http://schemas.microsoft.com/office/word/2018/wordml/cex" xmlns:w16cid="http://schemas.microsoft.com/office/word/2016/wordml/cid" xmlns:w16="http://schemas.microsoft.com/office/word/2018/wordml" xmlns:w16du="http://schemas.microsoft.com/office/word/2023/wordml/word16du" xmlns:w16sdtdh="http://schemas.microsoft.com/office/word/2020/wordml/sdtdatahash" xmlns:w16sdtfl="http://schemas.microsoft.com/office/word/2024/wordml/sdtformatlock" xmlns:w16se="http://schemas.microsoft.com/office/word/2015/wordml/symex" xmlns:wpg="http://schemas.microsoft.com/office/word/2010/wordprocessingGroup" xmlns:wpi="http://schemas.microsoft.com/office/word/2010/wordprocessingInk" xmlns:wne="http://schemas.microsoft.com/office/word/2006/wordml" xmlns:wps="http://schemas.microsoft.com/office/word/2010/wordprocessingShape" mc:Ignorable="w14 w15 w16se w16cid w16 w16cex w16sdtdh w16sdtfl w16du wp14">
   <w:abstractNum w:abstractNumId="0" w15:restartNumberingAfterBreak="0">
     <w:nsid w:val="010F4F59"/>
     <w:multiLevelType w:val="hybridMultilevel"/>
@@ -5531,7 +5611,7 @@
 </file>
 
 <file path=word/styles.xml><?xml version="1.0" encoding="utf-8"?>
-<w:styles xmlns:mc="http://schemas.openxmlformats.org/markup-compatibility/2006" xmlns:r="http://schemas.openxmlformats.org/officeDocument/2006/relationships" xmlns:w="http://schemas.openxmlformats.org/wordprocessingml/2006/main" xmlns:w14="http://schemas.microsoft.com/office/word/2010/wordml" xmlns:w15="http://schemas.microsoft.com/office/word/2012/wordml" xmlns:w16cex="http://schemas.microsoft.com/office/word/2018/wordml/cex" xmlns:w16cid="http://schemas.microsoft.com/office/word/2016/wordml/cid" xmlns:w16="http://schemas.microsoft.com/office/word/2018/wordml" xmlns:w16du="http://schemas.microsoft.com/office/word/2023/wordml/word16du" xmlns:w16sdtdh="http://schemas.microsoft.com/office/word/2020/wordml/sdtdatahash" xmlns:w16se="http://schemas.microsoft.com/office/word/2015/wordml/symex" mc:Ignorable="w14 w15 w16se w16cid w16 w16cex w16sdtdh w16du">
+<w:styles xmlns:mc="http://schemas.openxmlformats.org/markup-compatibility/2006" xmlns:r="http://schemas.openxmlformats.org/officeDocument/2006/relationships" xmlns:w="http://schemas.openxmlformats.org/wordprocessingml/2006/main" xmlns:w14="http://schemas.microsoft.com/office/word/2010/wordml" xmlns:w15="http://schemas.microsoft.com/office/word/2012/wordml" xmlns:w16cex="http://schemas.microsoft.com/office/word/2018/wordml/cex" xmlns:w16cid="http://schemas.microsoft.com/office/word/2016/wordml/cid" xmlns:w16="http://schemas.microsoft.com/office/word/2018/wordml" xmlns:w16du="http://schemas.microsoft.com/office/word/2023/wordml/word16du" xmlns:w16sdtdh="http://schemas.microsoft.com/office/word/2020/wordml/sdtdatahash" xmlns:w16sdtfl="http://schemas.microsoft.com/office/word/2024/wordml/sdtformatlock" xmlns:w16se="http://schemas.microsoft.com/office/word/2015/wordml/symex" mc:Ignorable="w14 w15 w16se w16cid w16 w16cex w16sdtdh w16sdtfl w16du">
   <w:docDefaults>
     <w:rPrDefault>
       <w:rPr>
@@ -6043,6 +6123,7 @@
   <w:style w:type="character" w:default="1" w:styleId="DefaultParagraphFont">
     <w:name w:val="Default Paragraph Font"/>
     <w:uiPriority w:val="1"/>
+    <w:semiHidden/>
     <w:unhideWhenUsed/>
   </w:style>
   <w:style w:type="table" w:default="1" w:styleId="TableNormal">
@@ -6181,8 +6262,11 @@
     <w:name w:val="Hyperlink"/>
     <w:basedOn w:val="DefaultParagraphFont"/>
     <w:uiPriority w:val="99"/>
-    <w:rsid w:val="00274DA4"/>
+    <w:rsid w:val="00202B1A"/>
     <w:rPr>
+      <w:rFonts w:ascii="Courier New" w:hAnsi="Courier New"/>
+      <w:b/>
+      <w:i w:val="0"/>
       <w:color w:val="4F81BD" w:themeColor="accent1"/>
     </w:rPr>
   </w:style>

</xml_diff>

<commit_message>
updated the Attack Surface Analysis - Analysis Procedure (provisioning ==> deployment)
</commit_message>
<xml_diff>
--- a/source/reference_documents/tertiary_documents/design/Attack Surface Analysis/analysis/Attack Surface Analysis - Analysis.docx
+++ b/source/reference_documents/tertiary_documents/design/Attack Surface Analysis/analysis/Attack Surface Analysis - Analysis.docx
@@ -38,7 +38,7 @@
         <w:t xml:space="preserve">Version </w:t>
       </w:r>
       <w:r>
-        <w:t>6</w:t>
+        <w:t>7</w:t>
       </w:r>
     </w:p>
     <w:p>
@@ -55,7 +55,7 @@
         <w:rPr>
           <w:noProof/>
         </w:rPr>
-        <w:t>12/4/25 8:05 AM</w:t>
+        <w:t>12/10/25 9:26 AM</w:t>
       </w:r>
       <w:r>
         <w:fldChar w:fldCharType="end"/>
@@ -1974,7 +1974,40 @@
         <w:jc w:val="both"/>
       </w:pPr>
       <w:r>
-        <w:t>Is the port only required for provisioning (includes software and configuration data)?</w:t>
+        <w:t xml:space="preserve">Is the port only required for </w:t>
+      </w:r>
+      <w:r>
+        <w:t>deployment</w:t>
+      </w:r>
+      <w:r>
+        <w:t>?</w:t>
+      </w:r>
+    </w:p>
+    <w:p>
+      <w:pPr>
+        <w:spacing w:after="240"/>
+        <w:ind w:left="810" w:hanging="810"/>
+        <w:jc w:val="both"/>
+      </w:pPr>
+      <w:r>
+        <w:rPr>
+          <w:b/>
+          <w:bCs/>
+          <w:color w:val="0070C0"/>
+        </w:rPr>
+        <w:t>Note</w:t>
+      </w:r>
+      <w:r>
+        <w:rPr>
+          <w:b/>
+          <w:bCs/>
+          <w:color w:val="0070C0"/>
+        </w:rPr>
+        <w:t>:</w:t>
+      </w:r>
+      <w:r>
+        <w:tab/>
+        <w:t>Deployment includes the provisioning, update, and decommissioning of both software and configuration data.</w:t>
       </w:r>
     </w:p>
     <w:p>
@@ -3940,10 +3973,7 @@
         <w:t>issue type</w:t>
       </w:r>
       <w:r>
-        <w:t xml:space="preserve"> and is not intended to be used in the issue table itself</w:t>
-      </w:r>
-      <w:r>
-        <w:t>.</w:t>
+        <w:t xml:space="preserve"> and is not intended to be used in the issue table itself.</w:t>
       </w:r>
     </w:p>
     <w:p>

</xml_diff>

<commit_message>
updated the Attack Surface Analysis - Analysis Procedure (more provisioning / deployment tweaks)
</commit_message>
<xml_diff>
--- a/source/reference_documents/tertiary_documents/design/Attack Surface Analysis/analysis/Attack Surface Analysis - Analysis.docx
+++ b/source/reference_documents/tertiary_documents/design/Attack Surface Analysis/analysis/Attack Surface Analysis - Analysis.docx
@@ -38,7 +38,7 @@
         <w:t xml:space="preserve">Version </w:t>
       </w:r>
       <w:r>
-        <w:t>7</w:t>
+        <w:t>8</w:t>
       </w:r>
     </w:p>
     <w:p>
@@ -55,7 +55,7 @@
         <w:rPr>
           <w:noProof/>
         </w:rPr>
-        <w:t>12/10/25 9:26 AM</w:t>
+        <w:t>12/10/25 12:11 PM</w:t>
       </w:r>
       <w:r>
         <w:fldChar w:fldCharType="end"/>
@@ -1696,7 +1696,34 @@
         <w:jc w:val="both"/>
       </w:pPr>
       <w:r>
-        <w:t>Is the port only required for provisioning (includes software and configuration data)?</w:t>
+        <w:t>Is the port only required for deployment?</w:t>
+      </w:r>
+    </w:p>
+    <w:p>
+      <w:pPr>
+        <w:spacing w:after="240"/>
+        <w:ind w:left="810" w:hanging="810"/>
+        <w:jc w:val="both"/>
+      </w:pPr>
+      <w:r>
+        <w:rPr>
+          <w:b/>
+          <w:bCs/>
+          <w:color w:val="0070C0"/>
+        </w:rPr>
+        <w:t>Note</w:t>
+      </w:r>
+      <w:r>
+        <w:rPr>
+          <w:b/>
+          <w:bCs/>
+          <w:color w:val="0070C0"/>
+        </w:rPr>
+        <w:t>:</w:t>
+      </w:r>
+      <w:r>
+        <w:tab/>
+        <w:t>Deployment includes the provisioning, update, and decommissioning of both software and configuration data.</w:t>
       </w:r>
     </w:p>
     <w:p>
@@ -2225,7 +2252,40 @@
         <w:jc w:val="both"/>
       </w:pPr>
       <w:r>
-        <w:t>Is the process used only for provisioning / update?</w:t>
+        <w:t xml:space="preserve">Is the </w:t>
+      </w:r>
+      <w:r>
+        <w:t>process</w:t>
+      </w:r>
+      <w:r>
+        <w:t xml:space="preserve"> only required for deployment?</w:t>
+      </w:r>
+    </w:p>
+    <w:p>
+      <w:pPr>
+        <w:spacing w:after="240"/>
+        <w:ind w:left="810" w:hanging="810"/>
+        <w:jc w:val="both"/>
+      </w:pPr>
+      <w:r>
+        <w:rPr>
+          <w:b/>
+          <w:bCs/>
+          <w:color w:val="0070C0"/>
+        </w:rPr>
+        <w:t>Note</w:t>
+      </w:r>
+      <w:r>
+        <w:rPr>
+          <w:b/>
+          <w:bCs/>
+          <w:color w:val="0070C0"/>
+        </w:rPr>
+        <w:t>:</w:t>
+      </w:r>
+      <w:r>
+        <w:tab/>
+        <w:t>Deployment includes the provisioning, update, and decommissioning of both software and configuration data.</w:t>
       </w:r>
     </w:p>
     <w:p>

</xml_diff>

<commit_message>
Updated the tertiary documents to correct reference to moved NCWF role material
</commit_message>
<xml_diff>
--- a/source/reference_documents/tertiary_documents/design/Attack Surface Analysis/analysis/Attack Surface Analysis - Analysis.docx
+++ b/source/reference_documents/tertiary_documents/design/Attack Surface Analysis/analysis/Attack Surface Analysis - Analysis.docx
@@ -38,7 +38,7 @@
         <w:t xml:space="preserve">Version </w:t>
       </w:r>
       <w:r>
-        <w:t>8</w:t>
+        <w:t>9</w:t>
       </w:r>
     </w:p>
     <w:p>
@@ -55,7 +55,7 @@
         <w:rPr>
           <w:noProof/>
         </w:rPr>
-        <w:t>12/10/25 12:11 PM</w:t>
+        <w:t>4/27/26 12:04 PM</w:t>
       </w:r>
       <w:r>
         <w:fldChar w:fldCharType="end"/>
@@ -754,6 +754,7 @@
       <w:pPr>
         <w:pStyle w:val="Heading3"/>
         <w:spacing w:after="240"/>
+        <w:jc w:val="both"/>
         <w:rPr>
           <w:color w:val="0070C0"/>
         </w:rPr>
@@ -795,23 +796,88 @@
           <w:sz w:val="22"/>
           <w:szCs w:val="22"/>
         </w:rPr>
-        <w:t xml:space="preserve"> role SP-ARC-002 and detailed in section </w:t>
-      </w:r>
-      <w:r>
-        <w:rPr>
-          <w:b/>
-          <w:bCs/>
-          <w:sz w:val="22"/>
-          <w:szCs w:val="22"/>
-        </w:rPr>
-        <w:t>12.7 Security Architect</w:t>
-      </w:r>
-      <w:r>
-        <w:rPr>
-          <w:sz w:val="22"/>
-          <w:szCs w:val="22"/>
-        </w:rPr>
-        <w:t xml:space="preserve"> of the AVCDL primary document </w:t>
+        <w:t xml:space="preserve"> role SP-ARC-002 and</w:t>
+      </w:r>
+      <w:r>
+        <w:rPr>
+          <w:sz w:val="22"/>
+          <w:szCs w:val="22"/>
+        </w:rPr>
+        <w:t xml:space="preserve"> detailed in</w:t>
+      </w:r>
+      <w:r>
+        <w:rPr>
+          <w:sz w:val="22"/>
+          <w:szCs w:val="22"/>
+        </w:rPr>
+        <w:t xml:space="preserve"> </w:t>
+      </w:r>
+      <w:r>
+        <w:rPr>
+          <w:sz w:val="22"/>
+          <w:szCs w:val="22"/>
+        </w:rPr>
+        <w:t>the</w:t>
+      </w:r>
+      <w:r>
+        <w:rPr>
+          <w:sz w:val="22"/>
+          <w:szCs w:val="22"/>
+        </w:rPr>
+        <w:t xml:space="preserve"> </w:t>
+      </w:r>
+      <w:r>
+        <w:rPr>
+          <w:b/>
+          <w:bCs/>
+          <w:sz w:val="22"/>
+          <w:szCs w:val="22"/>
+        </w:rPr>
+        <w:t>NCWF Roles - Security Architect</w:t>
+      </w:r>
+      <w:r>
+        <w:rPr>
+          <w:sz w:val="22"/>
+          <w:szCs w:val="22"/>
+        </w:rPr>
+        <w:t xml:space="preserve"> section of the </w:t>
+      </w:r>
+      <w:r>
+        <w:rPr>
+          <w:b/>
+          <w:bCs/>
+          <w:sz w:val="22"/>
+          <w:szCs w:val="22"/>
+        </w:rPr>
+        <w:t>AVCDL Background Material</w:t>
+      </w:r>
+      <w:r>
+        <w:rPr>
+          <w:sz w:val="22"/>
+          <w:szCs w:val="22"/>
+        </w:rPr>
+        <w:t xml:space="preserve"> elaboration</w:t>
+      </w:r>
+      <w:r>
+        <w:rPr>
+          <w:sz w:val="22"/>
+          <w:szCs w:val="22"/>
+        </w:rPr>
+        <w:t xml:space="preserve"> </w:t>
+      </w:r>
+      <w:r>
+        <w:rPr>
+          <w:sz w:val="22"/>
+          <w:szCs w:val="22"/>
+        </w:rPr>
+        <w:t>document</w:t>
+      </w:r>
+      <w:r>
+        <w:rPr>
+          <w:sz w:val="22"/>
+          <w:szCs w:val="22"/>
+        </w:rPr>
+        <w:t xml:space="preserve"> </w:t>
       </w:r>
       <w:r>
         <w:rPr>
@@ -822,7 +888,29 @@
           <w:szCs w:val="22"/>
           <w:vertAlign w:val="superscript"/>
         </w:rPr>
-        <w:t>[1]</w:t>
+        <w:t>[</w:t>
+      </w:r>
+      <w:r>
+        <w:rPr>
+          <w:b/>
+          <w:bCs/>
+          <w:color w:val="0070C0"/>
+          <w:sz w:val="22"/>
+          <w:szCs w:val="22"/>
+          <w:vertAlign w:val="superscript"/>
+        </w:rPr>
+        <w:t>1</w:t>
+      </w:r>
+      <w:r>
+        <w:rPr>
+          <w:b/>
+          <w:bCs/>
+          <w:color w:val="0070C0"/>
+          <w:sz w:val="22"/>
+          <w:szCs w:val="22"/>
+          <w:vertAlign w:val="superscript"/>
+        </w:rPr>
+        <w:t>1]</w:t>
       </w:r>
       <w:r>
         <w:rPr>
@@ -2252,13 +2340,7 @@
         <w:jc w:val="both"/>
       </w:pPr>
       <w:r>
-        <w:t xml:space="preserve">Is the </w:t>
-      </w:r>
-      <w:r>
-        <w:t>process</w:t>
-      </w:r>
-      <w:r>
-        <w:t xml:space="preserve"> only required for deployment?</w:t>
+        <w:t>Is the process only required for deployment?</w:t>
       </w:r>
     </w:p>
     <w:p>
@@ -4526,6 +4608,36 @@
           <w:t>https://www.nist.gov/identity-access-management/nist-special-publication-800-63-digital-identity-guidelines</w:t>
         </w:r>
       </w:hyperlink>
+    </w:p>
+    <w:p>
+      <w:pPr>
+        <w:pStyle w:val="ListParagraph"/>
+        <w:numPr>
+          <w:ilvl w:val="0"/>
+          <w:numId w:val="3"/>
+        </w:numPr>
+        <w:ind w:left="360"/>
+        <w:rPr>
+          <w:color w:val="000000" w:themeColor="text1"/>
+        </w:rPr>
+      </w:pPr>
+      <w:r>
+        <w:rPr>
+          <w:b/>
+          <w:bCs/>
+        </w:rPr>
+        <w:t xml:space="preserve">AVCDL Background Material </w:t>
+      </w:r>
+      <w:r>
+        <w:t>(AVCDL elaboration document)</w:t>
+      </w:r>
+      <w:r>
+        <w:rPr>
+          <w:b/>
+          <w:bCs/>
+        </w:rPr>
+        <w:t xml:space="preserve"> </w:t>
+      </w:r>
     </w:p>
     <w:p/>
     <w:sectPr>

</xml_diff>